<commit_message>
fix(quick-260402-jpl): repair malformed Jinja2 tag in A250.docx
- Table 0, Row 4, Col 5, Run 2: changed '}' (single) to '}}' (double)
- DocxTemplate.get_undeclared_template_variables() now returns without TemplateSyntaxError
- nya_project_code confirmed present in parsed variable set
</commit_message>
<xml_diff>
--- a/templates/A250.docx
+++ b/templates/A250.docx
@@ -127,8 +127,18 @@
               <w:right w:val="nil"/>
             </w:tcBorders>
           </w:tcPr>
-          <w:sdt>
-            <w:sdtPr>
+          <w:p>
+            <w:pPr>
+              <w:pStyle w:val="Heading2"/>
+              <w:framePr w:hSpace="0" w:wrap="auto" w:vAnchor="margin" w:yAlign="inline"/>
+              <w:suppressOverlap w:val="0"/>
+              <w:rPr>
+                <w:rFonts w:asciiTheme="majorHAnsi" w:hAnsiTheme="majorHAnsi" w:cstheme="majorHAnsi"/>
+                <w:sz w:val="20"/>
+                <w:szCs w:val="20"/>
+              </w:rPr>
+            </w:pPr>
+            <w:r>
               <w:rPr>
                 <w:rFonts w:asciiTheme="majorHAnsi" w:hAnsiTheme="majorHAnsi" w:cstheme="majorHAnsi"/>
                 <w:b w:val="0"/>
@@ -136,62 +146,31 @@
                 <w:sz w:val="20"/>
                 <w:szCs w:val="20"/>
               </w:rPr>
-              <w:alias w:val="Abstract"/>
-              <w:tag w:val=""/>
-              <w:id w:val="-1272471560"/>
-              <w:placeholder>
-                <w:docPart w:val="03C497ED04D2429D90C4BA38E6E3BB61"/>
-              </w:placeholder>
-              <w:dataBinding w:prefixMappings="xmlns:ns0='http://schemas.microsoft.com/office/2006/coverPageProps' " w:xpath="/ns0:CoverPageProperties[1]/ns0:Abstract[1]" w:storeItemID="{55AF091B-3C7A-41E3-B477-F2FDAA23CFDA}"/>
-              <w:text/>
-            </w:sdtPr>
-            <w:sdtContent>
-              <w:p>
-                <w:pPr>
-                  <w:pStyle w:val="Heading2"/>
-                  <w:framePr w:hSpace="0" w:wrap="auto" w:vAnchor="margin" w:yAlign="inline"/>
-                  <w:suppressOverlap w:val="0"/>
-                  <w:rPr>
-                    <w:rFonts w:asciiTheme="majorHAnsi" w:hAnsiTheme="majorHAnsi" w:cstheme="majorHAnsi"/>
-                    <w:sz w:val="20"/>
-                    <w:szCs w:val="20"/>
-                  </w:rPr>
-                </w:pPr>
-                <w:r>
-                  <w:rPr>
-                    <w:rFonts w:asciiTheme="majorHAnsi" w:hAnsiTheme="majorHAnsi" w:cstheme="majorHAnsi"/>
-                    <w:b w:val="0"/>
-                    <w:bCs w:val="0"/>
-                    <w:sz w:val="20"/>
-                    <w:szCs w:val="20"/>
-                  </w:rPr>
-                  <w:t>{{</w:t>
-                </w:r>
-                <w:proofErr w:type="spellStart"/>
-                <w:r>
-                  <w:rPr>
-                    <w:rFonts w:asciiTheme="majorHAnsi" w:hAnsiTheme="majorHAnsi" w:cstheme="majorHAnsi"/>
-                    <w:b w:val="0"/>
-                    <w:bCs w:val="0"/>
-                    <w:sz w:val="20"/>
-                    <w:szCs w:val="20"/>
-                  </w:rPr>
-                  <w:t>project_title</w:t>
-                </w:r>
-                <w:proofErr w:type="spellEnd"/>
-                <w:r>
-                  <w:rPr>
-                    <w:rFonts w:asciiTheme="majorHAnsi" w:hAnsiTheme="majorHAnsi" w:cstheme="majorHAnsi"/>
-                    <w:b w:val="0"/>
-                    <w:bCs w:val="0"/>
-                    <w:sz w:val="20"/>
-                    <w:szCs w:val="20"/>
-                  </w:rPr>
-                  <w:t>}}</w:t>
-                </w:r>
-              </w:p>
-            </w:sdtContent>
-          </w:sdt>
+              <w:t>{{</w:t>
+            </w:r>
+            <w:proofErr w:type="spellStart"/>
+            <w:r>
+              <w:rPr>
+                <w:rFonts w:asciiTheme="majorHAnsi" w:hAnsiTheme="majorHAnsi" w:cstheme="majorHAnsi"/>
+                <w:b w:val="0"/>
+                <w:bCs w:val="0"/>
+                <w:sz w:val="20"/>
+                <w:szCs w:val="20"/>
+              </w:rPr>
+              <w:t>project_title</w:t>
+            </w:r>
+            <w:proofErr w:type="spellEnd"/>
+            <w:r>
+              <w:rPr>
+                <w:rFonts w:asciiTheme="majorHAnsi" w:hAnsiTheme="majorHAnsi" w:cstheme="majorHAnsi"/>
+                <w:b w:val="0"/>
+                <w:bCs w:val="0"/>
+                <w:sz w:val="20"/>
+                <w:szCs w:val="20"/>
+              </w:rPr>
+              <w:t>}}</w:t>
+            </w:r>
+          </w:p>
         </w:tc>
         <w:tc>
           <w:tcPr>
@@ -280,16 +259,14 @@
               </w:rPr>
               <w:t>{{</w:t>
             </w:r>
-            <w:proofErr w:type="spellStart"/>
-            <w:r>
-              <w:rPr>
-                <w:rFonts w:asciiTheme="majorHAnsi" w:hAnsiTheme="majorHAnsi" w:cstheme="majorHAnsi"/>
-                <w:sz w:val="20"/>
-                <w:szCs w:val="20"/>
-              </w:rPr>
-              <w:t>current_date</w:t>
-            </w:r>
-            <w:proofErr w:type="spellEnd"/>
+            <w:r>
+              <w:rPr>
+                <w:rFonts w:asciiTheme="majorHAnsi" w:hAnsiTheme="majorHAnsi" w:cstheme="majorHAnsi"/>
+                <w:sz w:val="20"/>
+                <w:szCs w:val="20"/>
+              </w:rPr>
+              <w:t>today</w:t>
+            </w:r>
             <w:r>
               <w:rPr>
                 <w:rFonts w:asciiTheme="majorHAnsi" w:hAnsiTheme="majorHAnsi" w:cstheme="majorHAnsi"/>
@@ -568,51 +545,32 @@
                 <w:szCs w:val="20"/>
               </w:rPr>
             </w:pPr>
-            <w:sdt>
-              <w:sdtPr>
-                <w:rPr>
-                  <w:rFonts w:asciiTheme="majorHAnsi" w:hAnsiTheme="majorHAnsi" w:cstheme="majorHAnsi"/>
-                  <w:sz w:val="20"/>
-                  <w:szCs w:val="20"/>
-                </w:rPr>
-                <w:alias w:val="Manager"/>
-                <w:tag w:val=""/>
-                <w:id w:val="586342231"/>
-                <w:placeholder>
-                  <w:docPart w:val="90F9207E710449C394502BCE2D9557B0"/>
-                </w:placeholder>
-                <w:dataBinding w:prefixMappings="xmlns:ns0='http://schemas.openxmlformats.org/officeDocument/2006/extended-properties' " w:xpath="/ns0:Properties[1]/ns0:Manager[1]" w:storeItemID="{6668398D-A668-4E3E-A5EB-62B293D839F1}"/>
-                <w:text/>
-              </w:sdtPr>
-              <w:sdtContent>
-                <w:r>
-                  <w:rPr>
-                    <w:rFonts w:asciiTheme="majorHAnsi" w:hAnsiTheme="majorHAnsi" w:cstheme="majorHAnsi"/>
-                    <w:sz w:val="20"/>
-                    <w:szCs w:val="20"/>
-                  </w:rPr>
-                  <w:t>{{</w:t>
-                </w:r>
-                <w:proofErr w:type="spellStart"/>
-                <w:r>
-                  <w:rPr>
-                    <w:rFonts w:asciiTheme="majorHAnsi" w:hAnsiTheme="majorHAnsi" w:cstheme="majorHAnsi"/>
-                    <w:sz w:val="20"/>
-                    <w:szCs w:val="20"/>
-                  </w:rPr>
-                  <w:t>nya_project_code</w:t>
-                </w:r>
-                <w:proofErr w:type="spellEnd"/>
-                <w:r>
-                  <w:rPr>
-                    <w:rFonts w:asciiTheme="majorHAnsi" w:hAnsiTheme="majorHAnsi" w:cstheme="majorHAnsi"/>
-                    <w:sz w:val="20"/>
-                    <w:szCs w:val="20"/>
-                  </w:rPr>
-                  <w:t>}}</w:t>
-                </w:r>
-              </w:sdtContent>
-            </w:sdt>
+            <w:r>
+              <w:rPr>
+                <w:rFonts w:asciiTheme="majorHAnsi" w:hAnsiTheme="majorHAnsi" w:cstheme="majorHAnsi"/>
+                <w:sz w:val="20"/>
+                <w:szCs w:val="20"/>
+              </w:rPr>
+              <w:t>{{</w:t>
+            </w:r>
+            <w:proofErr w:type="spellStart"/>
+            <w:r>
+              <w:rPr>
+                <w:rFonts w:asciiTheme="majorHAnsi" w:hAnsiTheme="majorHAnsi" w:cstheme="majorHAnsi"/>
+                <w:sz w:val="20"/>
+                <w:szCs w:val="20"/>
+              </w:rPr>
+              <w:t>nya_project_code</w:t>
+            </w:r>
+            <w:proofErr w:type="spellEnd"/>
+            <w:r>
+              <w:rPr>
+                <w:rFonts w:asciiTheme="majorHAnsi" w:hAnsiTheme="majorHAnsi" w:cstheme="majorHAnsi"/>
+                <w:sz w:val="20"/>
+                <w:szCs w:val="20"/>
+              </w:rPr>
+              <w:t>}}</w:t>
+            </w:r>
           </w:p>
         </w:tc>
       </w:tr>
@@ -681,37 +639,16 @@
                 <w:szCs w:val="20"/>
               </w:rPr>
             </w:pPr>
-            <w:sdt>
-              <w:sdtPr>
-                <w:rPr>
-                  <w:rFonts w:asciiTheme="majorHAnsi" w:hAnsiTheme="majorHAnsi" w:cstheme="majorHAnsi"/>
-                  <w:b/>
-                  <w:bCs/>
-                  <w:sz w:val="20"/>
-                  <w:szCs w:val="20"/>
-                </w:rPr>
-                <w:alias w:val="Company"/>
-                <w:tag w:val=""/>
-                <w:id w:val="647249472"/>
-                <w:placeholder>
-                  <w:docPart w:val="18376EC9D5194D969BBC365E79690AD7"/>
-                </w:placeholder>
-                <w:dataBinding w:prefixMappings="xmlns:ns0='http://schemas.openxmlformats.org/officeDocument/2006/extended-properties' " w:xpath="/ns0:Properties[1]/ns0:Company[1]" w:storeItemID="{6668398D-A668-4E3E-A5EB-62B293D839F1}"/>
-                <w:text/>
-              </w:sdtPr>
-              <w:sdtContent>
-                <w:r>
-                  <w:rPr>
-                    <w:rFonts w:asciiTheme="majorHAnsi" w:hAnsiTheme="majorHAnsi" w:cstheme="majorHAnsi"/>
-                    <w:b/>
-                    <w:bCs/>
-                    <w:sz w:val="20"/>
-                    <w:szCs w:val="20"/>
-                  </w:rPr>
-                  <w:t>{{client}}</w:t>
-                </w:r>
-              </w:sdtContent>
-            </w:sdt>
+            <w:r>
+              <w:rPr>
+                <w:rFonts w:asciiTheme="majorHAnsi" w:hAnsiTheme="majorHAnsi" w:cstheme="majorHAnsi"/>
+                <w:b/>
+                <w:bCs/>
+                <w:sz w:val="20"/>
+                <w:szCs w:val="20"/>
+              </w:rPr>
+              <w:t>{{client}}</w:t>
+            </w:r>
             <w:r>
               <w:rPr>
                 <w:rFonts w:asciiTheme="majorHAnsi" w:hAnsiTheme="majorHAnsi" w:cstheme="majorHAnsi"/>
@@ -997,207 +934,32 @@
                 <w:szCs w:val="20"/>
               </w:rPr>
             </w:pPr>
-            <w:sdt>
-              <w:sdtPr>
-                <w:rPr>
-                  <w:rFonts w:asciiTheme="majorHAnsi" w:hAnsiTheme="majorHAnsi" w:cstheme="majorHAnsi"/>
-                  <w:sz w:val="20"/>
-                  <w:szCs w:val="20"/>
-                </w:rPr>
-                <w:alias w:val="Comments"/>
-                <w:tag w:val=""/>
-                <w:id w:val="-1892019177"/>
-                <w:placeholder>
-                  <w:docPart w:val="116815963BB84359A53653EBB8E88613"/>
-                </w:placeholder>
-                <w:dataBinding w:prefixMappings="xmlns:ns0='http://purl.org/dc/elements/1.1/' xmlns:ns1='http://schemas.openxmlformats.org/package/2006/metadata/core-properties' " w:xpath="/ns1:coreProperties[1]/ns0:description[1]" w:storeItemID="{6C3C8BC8-F283-45AE-878A-BAB7291924A1}"/>
-                <w:text w:multiLine="1"/>
-              </w:sdtPr>
-              <w:sdtContent>
-                <w:r>
-                  <w:rPr>
-                    <w:rFonts w:asciiTheme="majorHAnsi" w:hAnsiTheme="majorHAnsi" w:cstheme="majorHAnsi"/>
-                    <w:sz w:val="20"/>
-                    <w:szCs w:val="20"/>
-                  </w:rPr>
-                  <w:t>{{</w:t>
-                </w:r>
-                <w:proofErr w:type="spellStart"/>
-                <w:r>
-                  <w:rPr>
-                    <w:rFonts w:asciiTheme="majorHAnsi" w:hAnsiTheme="majorHAnsi" w:cstheme="majorHAnsi"/>
-                    <w:sz w:val="20"/>
-                    <w:szCs w:val="20"/>
-                  </w:rPr>
-                  <w:t>F</w:t>
-                </w:r>
-                <w:r>
-                  <w:rPr>
-                    <w:rFonts w:asciiTheme="majorHAnsi" w:hAnsiTheme="majorHAnsi" w:cstheme="majorHAnsi"/>
-                    <w:sz w:val="20"/>
-                    <w:szCs w:val="20"/>
-                  </w:rPr>
-                  <w:t>name</w:t>
-                </w:r>
-                <w:r>
-                  <w:rPr>
-                    <w:rFonts w:asciiTheme="majorHAnsi" w:hAnsiTheme="majorHAnsi" w:cstheme="majorHAnsi"/>
-                    <w:sz w:val="20"/>
-                    <w:szCs w:val="20"/>
-                  </w:rPr>
-                  <w:t>_R</w:t>
-                </w:r>
-                <w:proofErr w:type="spellEnd"/>
-                <w:r>
-                  <w:rPr>
-                    <w:rFonts w:asciiTheme="majorHAnsi" w:hAnsiTheme="majorHAnsi" w:cstheme="majorHAnsi"/>
-                    <w:sz w:val="20"/>
-                    <w:szCs w:val="20"/>
-                  </w:rPr>
-                  <w:t>}}</w:t>
-                </w:r>
-              </w:sdtContent>
-            </w:sdt>
-            <w:r>
-              <w:rPr>
-                <w:rFonts w:asciiTheme="majorHAnsi" w:hAnsiTheme="majorHAnsi" w:cstheme="majorHAnsi"/>
-                <w:sz w:val="20"/>
-                <w:szCs w:val="20"/>
-              </w:rPr>
-              <w:t xml:space="preserve"> </w:t>
-            </w:r>
-            <w:sdt>
-              <w:sdtPr>
-                <w:rPr>
-                  <w:rFonts w:asciiTheme="majorHAnsi" w:hAnsiTheme="majorHAnsi" w:cstheme="majorHAnsi"/>
-                  <w:sz w:val="20"/>
-                  <w:szCs w:val="20"/>
-                </w:rPr>
-                <w:alias w:val="Company Fax"/>
-                <w:tag w:val=""/>
-                <w:id w:val="1376743969"/>
-                <w:placeholder>
-                  <w:docPart w:val="3DAD588D58684F0BB72AAF6F298DF15B"/>
-                </w:placeholder>
-                <w:dataBinding w:prefixMappings="xmlns:ns0='http://schemas.microsoft.com/office/2006/coverPageProps' " w:xpath="/ns0:CoverPageProperties[1]/ns0:CompanyFax[1]" w:storeItemID="{55AF091B-3C7A-41E3-B477-F2FDAA23CFDA}"/>
-                <w:text/>
-              </w:sdtPr>
-              <w:sdtContent>
-                <w:r>
-                  <w:rPr>
-                    <w:rFonts w:asciiTheme="majorHAnsi" w:hAnsiTheme="majorHAnsi" w:cstheme="majorHAnsi"/>
-                    <w:sz w:val="20"/>
-                    <w:szCs w:val="20"/>
-                  </w:rPr>
-                  <w:t>{{Lname_R}}</w:t>
-                </w:r>
-              </w:sdtContent>
-            </w:sdt>
-            <w:r>
-              <w:rPr>
-                <w:rFonts w:asciiTheme="majorHAnsi" w:hAnsiTheme="majorHAnsi" w:cstheme="majorHAnsi"/>
-                <w:sz w:val="20"/>
-                <w:szCs w:val="20"/>
-              </w:rPr>
-              <w:t xml:space="preserve">, </w:t>
-            </w:r>
-            <w:r>
-              <w:rPr>
-                <w:rFonts w:asciiTheme="majorHAnsi" w:hAnsiTheme="majorHAnsi" w:cstheme="majorHAnsi"/>
-                <w:sz w:val="20"/>
-                <w:szCs w:val="20"/>
-              </w:rPr>
-              <w:t>{{licenses}}</w:t>
-            </w:r>
-            <w:r>
-              <w:rPr>
-                <w:rFonts w:asciiTheme="majorHAnsi" w:hAnsiTheme="majorHAnsi" w:cstheme="majorHAnsi"/>
-                <w:sz w:val="20"/>
-                <w:szCs w:val="20"/>
-              </w:rPr>
-              <w:t xml:space="preserve">, </w:t>
-            </w:r>
-            <w:sdt>
-              <w:sdtPr>
-                <w:rPr>
-                  <w:rFonts w:asciiTheme="majorHAnsi" w:hAnsiTheme="majorHAnsi" w:cstheme="majorHAnsi"/>
-                  <w:sz w:val="20"/>
-                  <w:szCs w:val="20"/>
-                </w:rPr>
-                <w:alias w:val="Title"/>
-                <w:tag w:val=""/>
-                <w:id w:val="-88235873"/>
-                <w:placeholder>
-                  <w:docPart w:val="6C09CEC241A04607BEC0EE91F1A9D781"/>
-                </w:placeholder>
-                <w:dataBinding w:prefixMappings="xmlns:ns0='http://purl.org/dc/elements/1.1/' xmlns:ns1='http://schemas.openxmlformats.org/package/2006/metadata/core-properties' " w:xpath="/ns1:coreProperties[1]/ns0:title[1]" w:storeItemID="{6C3C8BC8-F283-45AE-878A-BAB7291924A1}"/>
-                <w:text/>
-              </w:sdtPr>
-              <w:sdtContent>
-                <w:r>
-                  <w:rPr>
-                    <w:rFonts w:asciiTheme="majorHAnsi" w:hAnsiTheme="majorHAnsi" w:cstheme="majorHAnsi"/>
-                    <w:sz w:val="20"/>
-                    <w:szCs w:val="20"/>
-                  </w:rPr>
-                  <w:t>{{</w:t>
-                </w:r>
-                <w:proofErr w:type="spellStart"/>
-                <w:r>
-                  <w:rPr>
-                    <w:rFonts w:asciiTheme="majorHAnsi" w:hAnsiTheme="majorHAnsi" w:cstheme="majorHAnsi"/>
-                    <w:sz w:val="20"/>
-                    <w:szCs w:val="20"/>
-                  </w:rPr>
-                  <w:t>title_R</w:t>
-                </w:r>
-                <w:proofErr w:type="spellEnd"/>
-                <w:r>
-                  <w:rPr>
-                    <w:rFonts w:asciiTheme="majorHAnsi" w:hAnsiTheme="majorHAnsi" w:cstheme="majorHAnsi"/>
-                    <w:sz w:val="20"/>
-                    <w:szCs w:val="20"/>
-                  </w:rPr>
-                  <w:t>}}</w:t>
-                </w:r>
-              </w:sdtContent>
-            </w:sdt>
-          </w:p>
-          <w:p>
-            <w:pPr>
-              <w:rPr>
-                <w:rFonts w:asciiTheme="majorHAnsi" w:hAnsiTheme="majorHAnsi" w:cstheme="majorHAnsi"/>
-                <w:sz w:val="20"/>
-                <w:szCs w:val="20"/>
-              </w:rPr>
-            </w:pPr>
-            <w:sdt>
-              <w:sdtPr>
-                <w:rPr>
-                  <w:rFonts w:asciiTheme="majorHAnsi" w:hAnsiTheme="majorHAnsi" w:cstheme="majorHAnsi"/>
-                  <w:sz w:val="20"/>
-                  <w:szCs w:val="20"/>
-                </w:rPr>
-                <w:alias w:val="Company"/>
-                <w:tag w:val=""/>
-                <w:id w:val="629444093"/>
-                <w:placeholder>
-                  <w:docPart w:val="44C531E184D242218B8BDC5CAF487F59"/>
-                </w:placeholder>
-                <w:dataBinding w:prefixMappings="xmlns:ns0='http://schemas.openxmlformats.org/officeDocument/2006/extended-properties' " w:xpath="/ns0:Properties[1]/ns0:Company[1]" w:storeItemID="{6668398D-A668-4E3E-A5EB-62B293D839F1}"/>
-                <w:text/>
-              </w:sdtPr>
-              <w:sdtContent>
-                <w:r>
-                  <w:rPr>
-                    <w:rFonts w:asciiTheme="majorHAnsi" w:hAnsiTheme="majorHAnsi" w:cstheme="majorHAnsi"/>
-                    <w:sz w:val="20"/>
-                    <w:szCs w:val="20"/>
-                  </w:rPr>
-                  <w:t>{{client}}</w:t>
-                </w:r>
-              </w:sdtContent>
-            </w:sdt>
+            <w:r>
+              <w:rPr>
+                <w:rFonts w:asciiTheme="majorHAnsi" w:hAnsiTheme="majorHAnsi" w:cstheme="majorHAnsi"/>
+                <w:sz w:val="20"/>
+                <w:szCs w:val="20"/>
+              </w:rPr>
+              <w:t>{{</w:t>
+            </w:r>
+            <w:proofErr w:type="spellStart"/>
+            <w:r>
+              <w:rPr>
+                <w:rFonts w:asciiTheme="majorHAnsi" w:hAnsiTheme="majorHAnsi" w:cstheme="majorHAnsi"/>
+                <w:sz w:val="20"/>
+                <w:szCs w:val="20"/>
+              </w:rPr>
+              <w:t>requested_by</w:t>
+            </w:r>
+            <w:proofErr w:type="spellEnd"/>
+            <w:r>
+              <w:rPr>
+                <w:rFonts w:asciiTheme="majorHAnsi" w:hAnsiTheme="majorHAnsi" w:cstheme="majorHAnsi"/>
+                <w:sz w:val="20"/>
+                <w:szCs w:val="20"/>
+              </w:rPr>
+              <w:t>}}</w:t>
+            </w:r>
           </w:p>
         </w:tc>
         <w:tc>
@@ -1277,42 +1039,6 @@
               <w:t>}}</w:t>
             </w:r>
           </w:p>
-          <w:sdt>
-            <w:sdtPr>
-              <w:rPr>
-                <w:rFonts w:asciiTheme="majorHAnsi" w:hAnsiTheme="majorHAnsi" w:cstheme="majorHAnsi"/>
-                <w:sz w:val="20"/>
-                <w:szCs w:val="20"/>
-              </w:rPr>
-              <w:alias w:val="Company"/>
-              <w:tag w:val=""/>
-              <w:id w:val="938256018"/>
-              <w:placeholder>
-                <w:docPart w:val="F516A635CC8B4A7FAE7432B54B847DA4"/>
-              </w:placeholder>
-              <w:dataBinding w:prefixMappings="xmlns:ns0='http://schemas.openxmlformats.org/officeDocument/2006/extended-properties' " w:xpath="/ns0:Properties[1]/ns0:Company[1]" w:storeItemID="{6668398D-A668-4E3E-A5EB-62B293D839F1}"/>
-              <w:text/>
-            </w:sdtPr>
-            <w:sdtContent>
-              <w:p>
-                <w:pPr>
-                  <w:rPr>
-                    <w:rFonts w:asciiTheme="majorHAnsi" w:hAnsiTheme="majorHAnsi" w:cstheme="majorHAnsi"/>
-                    <w:sz w:val="20"/>
-                    <w:szCs w:val="20"/>
-                  </w:rPr>
-                </w:pPr>
-                <w:r>
-                  <w:rPr>
-                    <w:rFonts w:asciiTheme="majorHAnsi" w:hAnsiTheme="majorHAnsi" w:cstheme="majorHAnsi"/>
-                    <w:sz w:val="20"/>
-                    <w:szCs w:val="20"/>
-                  </w:rPr>
-                  <w:t>{{client}}</w:t>
-                </w:r>
-              </w:p>
-            </w:sdtContent>
-          </w:sdt>
         </w:tc>
       </w:tr>
       <w:tr>
@@ -1462,6 +1188,14 @@
               </w:rPr>
               <w:t>client_office</w:t>
             </w:r>
+            <w:r>
+              <w:rPr>
+                <w:rFonts w:asciiTheme="majorHAnsi" w:hAnsiTheme="majorHAnsi" w:cstheme="majorHAnsi"/>
+                <w:sz w:val="20"/>
+                <w:szCs w:val="20"/>
+              </w:rPr>
+              <w:t>_no</w:t>
+            </w:r>
             <w:proofErr w:type="spellEnd"/>
             <w:r>
               <w:rPr>
@@ -1620,6 +1354,14 @@
                 <w:szCs w:val="20"/>
               </w:rPr>
               <w:t>client_invoice</w:t>
+            </w:r>
+            <w:r>
+              <w:rPr>
+                <w:rFonts w:asciiTheme="majorHAnsi" w:hAnsiTheme="majorHAnsi" w:cstheme="majorHAnsi"/>
+                <w:sz w:val="20"/>
+                <w:szCs w:val="20"/>
+              </w:rPr>
+              <w:t>_email</w:t>
             </w:r>
             <w:proofErr w:type="spellEnd"/>
             <w:r>
@@ -1978,83 +1720,52 @@
             </w:r>
           </w:p>
         </w:tc>
-        <w:sdt>
-          <w:sdtPr>
-            <w:rPr>
-              <w:rStyle w:val="CenturyGothic"/>
-              <w:rFonts w:asciiTheme="majorHAnsi" w:hAnsiTheme="majorHAnsi" w:cstheme="majorHAnsi"/>
-              <w:sz w:val="20"/>
-              <w:szCs w:val="20"/>
-            </w:rPr>
-            <w:id w:val="-334849634"/>
-            <w:placeholder>
-              <w:docPart w:val="BAEDA66374AF438887EA8307BB7EA83D"/>
-            </w:placeholder>
-            <w15:color w:val="32AF37"/>
-            <w:date>
-              <w:dateFormat w:val="MMMM d, yyyy"/>
-              <w:lid w:val="en-US"/>
-              <w:storeMappedDataAs w:val="dateTime"/>
-              <w:calendar w:val="gregorian"/>
-            </w:date>
-          </w:sdtPr>
-          <w:sdtEndPr>
-            <w:rPr>
-              <w:rStyle w:val="DefaultParagraphFont"/>
-            </w:rPr>
-          </w:sdtEndPr>
-          <w:sdtContent>
-            <w:tc>
-              <w:tcPr>
-                <w:tcW w:w="3696" w:type="dxa"/>
-                <w:vMerge w:val="restart"/>
-                <w:tcBorders>
-                  <w:top w:val="single" w:sz="4" w:space="0" w:color="A6A6A6" w:themeColor="background1" w:themeShade="A6"/>
-                  <w:left w:val="nil"/>
-                  <w:right w:val="single" w:sz="4" w:space="0" w:color="A6A6A6" w:themeColor="background1" w:themeShade="A6"/>
-                </w:tcBorders>
-              </w:tcPr>
-              <w:p>
-                <w:pPr>
-                  <w:rPr>
-                    <w:rFonts w:asciiTheme="majorHAnsi" w:hAnsiTheme="majorHAnsi" w:cstheme="majorHAnsi"/>
-                    <w:sz w:val="20"/>
-                    <w:szCs w:val="20"/>
-                  </w:rPr>
-                </w:pPr>
-                <w:r>
-                  <w:rPr>
-                    <w:rStyle w:val="CenturyGothic"/>
-                    <w:rFonts w:asciiTheme="majorHAnsi" w:hAnsiTheme="majorHAnsi" w:cstheme="majorHAnsi"/>
-                    <w:sz w:val="20"/>
-                    <w:szCs w:val="20"/>
-                  </w:rPr>
-                  <w:t>{{</w:t>
-                </w:r>
-                <w:proofErr w:type="spellStart"/>
-                <w:r>
-                  <w:rPr>
-                    <w:rStyle w:val="CenturyGothic"/>
-                    <w:rFonts w:asciiTheme="majorHAnsi" w:hAnsiTheme="majorHAnsi" w:cstheme="majorHAnsi"/>
-                    <w:sz w:val="20"/>
-                    <w:szCs w:val="20"/>
-                  </w:rPr>
-                  <w:t>request_date</w:t>
-                </w:r>
-                <w:proofErr w:type="spellEnd"/>
-                <w:r>
-                  <w:rPr>
-                    <w:rStyle w:val="CenturyGothic"/>
-                    <w:rFonts w:asciiTheme="majorHAnsi" w:hAnsiTheme="majorHAnsi" w:cstheme="majorHAnsi"/>
-                    <w:sz w:val="20"/>
-                    <w:szCs w:val="20"/>
-                  </w:rPr>
-                  <w:t>}}</w:t>
-                </w:r>
-              </w:p>
-            </w:tc>
-          </w:sdtContent>
-        </w:sdt>
+        <w:tc>
+          <w:tcPr>
+            <w:tcW w:w="3696" w:type="dxa"/>
+            <w:vMerge w:val="restart"/>
+            <w:tcBorders>
+              <w:top w:val="single" w:sz="4" w:space="0" w:color="A6A6A6" w:themeColor="background1" w:themeShade="A6"/>
+              <w:left w:val="nil"/>
+              <w:right w:val="single" w:sz="4" w:space="0" w:color="A6A6A6" w:themeColor="background1" w:themeShade="A6"/>
+            </w:tcBorders>
+          </w:tcPr>
+          <w:p>
+            <w:pPr>
+              <w:rPr>
+                <w:rFonts w:asciiTheme="majorHAnsi" w:hAnsiTheme="majorHAnsi" w:cstheme="majorHAnsi"/>
+                <w:sz w:val="20"/>
+                <w:szCs w:val="20"/>
+              </w:rPr>
+            </w:pPr>
+            <w:r>
+              <w:rPr>
+                <w:rFonts w:asciiTheme="majorHAnsi" w:hAnsiTheme="majorHAnsi" w:cstheme="majorHAnsi"/>
+                <w:sz w:val="20"/>
+                <w:szCs w:val="20"/>
+              </w:rPr>
+              <w:t>{{</w:t>
+            </w:r>
+            <w:proofErr w:type="spellStart"/>
+            <w:r>
+              <w:rPr>
+                <w:rFonts w:asciiTheme="majorHAnsi" w:hAnsiTheme="majorHAnsi" w:cstheme="majorHAnsi"/>
+                <w:sz w:val="20"/>
+                <w:szCs w:val="20"/>
+              </w:rPr>
+              <w:t>request_date</w:t>
+            </w:r>
+            <w:proofErr w:type="spellEnd"/>
+            <w:r>
+              <w:rPr>
+                <w:rFonts w:asciiTheme="majorHAnsi" w:hAnsiTheme="majorHAnsi" w:cstheme="majorHAnsi"/>
+                <w:sz w:val="20"/>
+                <w:szCs w:val="20"/>
+              </w:rPr>
+              <w:t>}}</w:t>
+            </w:r>
+          </w:p>
+        </w:tc>
       </w:tr>
       <w:tr>
         <w:trPr>
@@ -2172,7 +1883,25 @@
                 <w:sz w:val="20"/>
                 <w:szCs w:val="20"/>
               </w:rPr>
-              <w:t>Nabih Youssef and Associates (NYA) is pleased</w:t>
+              <w:t xml:space="preserve">Nabih Youssef and Associates (NYA) </w:t>
+            </w:r>
+            <w:proofErr w:type="gramStart"/>
+            <w:r>
+              <w:rPr>
+                <w:rFonts w:asciiTheme="majorHAnsi" w:hAnsiTheme="majorHAnsi" w:cstheme="majorHAnsi"/>
+                <w:sz w:val="20"/>
+                <w:szCs w:val="20"/>
+              </w:rPr>
+              <w:t>is</w:t>
+            </w:r>
+            <w:proofErr w:type="gramEnd"/>
+            <w:r>
+              <w:rPr>
+                <w:rFonts w:asciiTheme="majorHAnsi" w:hAnsiTheme="majorHAnsi" w:cstheme="majorHAnsi"/>
+                <w:sz w:val="20"/>
+                <w:szCs w:val="20"/>
+              </w:rPr>
+              <w:t xml:space="preserve"> pleased</w:t>
             </w:r>
             <w:r>
               <w:rPr>
@@ -2204,7 +1933,16 @@
                 <w:sz w:val="20"/>
                 <w:szCs w:val="20"/>
               </w:rPr>
-              <w:t>provide this proposal as requested by</w:t>
+              <w:t xml:space="preserve">provide this proposal as </w:t>
+            </w:r>
+            <w:proofErr w:type="gramStart"/>
+            <w:r>
+              <w:rPr>
+                <w:rFonts w:asciiTheme="majorHAnsi" w:hAnsiTheme="majorHAnsi" w:cstheme="majorHAnsi"/>
+                <w:sz w:val="20"/>
+                <w:szCs w:val="20"/>
+              </w:rPr>
+              <w:t>requested by</w:t>
             </w:r>
             <w:r>
               <w:rPr>
@@ -2214,51 +1952,41 @@
               </w:rPr>
               <w:t xml:space="preserve"> </w:t>
             </w:r>
-            <w:sdt>
-              <w:sdtPr>
-                <w:rPr>
-                  <w:rFonts w:asciiTheme="majorHAnsi" w:hAnsiTheme="majorHAnsi" w:cstheme="majorHAnsi"/>
-                  <w:sz w:val="20"/>
-                  <w:szCs w:val="20"/>
-                </w:rPr>
-                <w:alias w:val="Comments"/>
-                <w:tag w:val=""/>
-                <w:id w:val="493535338"/>
-                <w:placeholder>
-                  <w:docPart w:val="1A636D5B73024EBB892EB9AD446AB78B"/>
-                </w:placeholder>
-                <w:dataBinding w:prefixMappings="xmlns:ns0='http://purl.org/dc/elements/1.1/' xmlns:ns1='http://schemas.openxmlformats.org/package/2006/metadata/core-properties' " w:xpath="/ns1:coreProperties[1]/ns0:description[1]" w:storeItemID="{6C3C8BC8-F283-45AE-878A-BAB7291924A1}"/>
-                <w:text w:multiLine="1"/>
-              </w:sdtPr>
-              <w:sdtContent>
-                <w:r>
-                  <w:rPr>
-                    <w:rFonts w:asciiTheme="majorHAnsi" w:hAnsiTheme="majorHAnsi" w:cstheme="majorHAnsi"/>
-                    <w:sz w:val="20"/>
-                    <w:szCs w:val="20"/>
-                  </w:rPr>
-                  <w:t>{{</w:t>
-                </w:r>
-                <w:proofErr w:type="spellStart"/>
-                <w:r>
-                  <w:rPr>
-                    <w:rFonts w:asciiTheme="majorHAnsi" w:hAnsiTheme="majorHAnsi" w:cstheme="majorHAnsi"/>
-                    <w:sz w:val="20"/>
-                    <w:szCs w:val="20"/>
-                  </w:rPr>
-                  <w:t>Fname_R</w:t>
-                </w:r>
-                <w:proofErr w:type="spellEnd"/>
-                <w:r>
-                  <w:rPr>
-                    <w:rFonts w:asciiTheme="majorHAnsi" w:hAnsiTheme="majorHAnsi" w:cstheme="majorHAnsi"/>
-                    <w:sz w:val="20"/>
-                    <w:szCs w:val="20"/>
-                  </w:rPr>
-                  <w:t>}}</w:t>
-                </w:r>
-              </w:sdtContent>
-            </w:sdt>
+            <w:r>
+              <w:rPr>
+                <w:rFonts w:asciiTheme="majorHAnsi" w:hAnsiTheme="majorHAnsi" w:cstheme="majorHAnsi"/>
+                <w:sz w:val="20"/>
+                <w:szCs w:val="20"/>
+              </w:rPr>
+              <w:t>{{</w:t>
+            </w:r>
+            <w:proofErr w:type="spellStart"/>
+            <w:r>
+              <w:rPr>
+                <w:rFonts w:asciiTheme="majorHAnsi" w:hAnsiTheme="majorHAnsi" w:cstheme="majorHAnsi"/>
+                <w:sz w:val="20"/>
+                <w:szCs w:val="20"/>
+              </w:rPr>
+              <w:t>requested_</w:t>
+            </w:r>
+            <w:proofErr w:type="gramEnd"/>
+            <w:r>
+              <w:rPr>
+                <w:rFonts w:asciiTheme="majorHAnsi" w:hAnsiTheme="majorHAnsi" w:cstheme="majorHAnsi"/>
+                <w:sz w:val="20"/>
+                <w:szCs w:val="20"/>
+              </w:rPr>
+              <w:t>by</w:t>
+            </w:r>
+            <w:proofErr w:type="spellEnd"/>
+            <w:r>
+              <w:rPr>
+                <w:rFonts w:asciiTheme="majorHAnsi" w:hAnsiTheme="majorHAnsi" w:cstheme="majorHAnsi"/>
+                <w:sz w:val="20"/>
+                <w:szCs w:val="20"/>
+              </w:rPr>
+              <w:t>}}</w:t>
+            </w:r>
             <w:r>
               <w:rPr>
                 <w:rFonts w:asciiTheme="majorHAnsi" w:hAnsiTheme="majorHAnsi" w:cstheme="majorHAnsi"/>
@@ -2267,33 +1995,14 @@
               </w:rPr>
               <w:t xml:space="preserve"> </w:t>
             </w:r>
-            <w:sdt>
-              <w:sdtPr>
-                <w:rPr>
-                  <w:rFonts w:asciiTheme="majorHAnsi" w:hAnsiTheme="majorHAnsi" w:cstheme="majorHAnsi"/>
-                  <w:sz w:val="20"/>
-                  <w:szCs w:val="20"/>
-                </w:rPr>
-                <w:alias w:val="Company Fax"/>
-                <w:tag w:val=""/>
-                <w:id w:val="-863208491"/>
-                <w:placeholder>
-                  <w:docPart w:val="7F717849E9704017B24D66515D73C652"/>
-                </w:placeholder>
-                <w:dataBinding w:prefixMappings="xmlns:ns0='http://schemas.microsoft.com/office/2006/coverPageProps' " w:xpath="/ns0:CoverPageProperties[1]/ns0:CompanyFax[1]" w:storeItemID="{55AF091B-3C7A-41E3-B477-F2FDAA23CFDA}"/>
-                <w:text/>
-              </w:sdtPr>
-              <w:sdtContent>
-                <w:r>
-                  <w:rPr>
-                    <w:rFonts w:asciiTheme="majorHAnsi" w:hAnsiTheme="majorHAnsi" w:cstheme="majorHAnsi"/>
-                    <w:sz w:val="20"/>
-                    <w:szCs w:val="20"/>
-                  </w:rPr>
-                  <w:t>{{Lname_R}}</w:t>
-                </w:r>
-              </w:sdtContent>
-            </w:sdt>
+            <w:r>
+              <w:rPr>
+                <w:rFonts w:asciiTheme="majorHAnsi" w:hAnsiTheme="majorHAnsi" w:cstheme="majorHAnsi"/>
+                <w:sz w:val="20"/>
+                <w:szCs w:val="20"/>
+              </w:rPr>
+              <w:t>of</w:t>
+            </w:r>
             <w:r>
               <w:rPr>
                 <w:rFonts w:asciiTheme="majorHAnsi" w:hAnsiTheme="majorHAnsi" w:cstheme="majorHAnsi"/>
@@ -2308,43 +2017,8 @@
                 <w:sz w:val="20"/>
                 <w:szCs w:val="20"/>
               </w:rPr>
-              <w:t>of</w:t>
-            </w:r>
-            <w:r>
-              <w:rPr>
-                <w:rFonts w:asciiTheme="majorHAnsi" w:hAnsiTheme="majorHAnsi" w:cstheme="majorHAnsi"/>
-                <w:sz w:val="20"/>
-                <w:szCs w:val="20"/>
-              </w:rPr>
-              <w:t xml:space="preserve"> </w:t>
-            </w:r>
-            <w:sdt>
-              <w:sdtPr>
-                <w:rPr>
-                  <w:rFonts w:asciiTheme="majorHAnsi" w:hAnsiTheme="majorHAnsi" w:cstheme="majorHAnsi"/>
-                  <w:sz w:val="20"/>
-                  <w:szCs w:val="20"/>
-                </w:rPr>
-                <w:alias w:val="Company"/>
-                <w:tag w:val=""/>
-                <w:id w:val="1447898488"/>
-                <w:placeholder>
-                  <w:docPart w:val="90C431DA247A4D90A0333664E418580A"/>
-                </w:placeholder>
-                <w:dataBinding w:prefixMappings="xmlns:ns0='http://schemas.openxmlformats.org/officeDocument/2006/extended-properties' " w:xpath="/ns0:Properties[1]/ns0:Company[1]" w:storeItemID="{6668398D-A668-4E3E-A5EB-62B293D839F1}"/>
-                <w:text/>
-              </w:sdtPr>
-              <w:sdtContent>
-                <w:r>
-                  <w:rPr>
-                    <w:rFonts w:asciiTheme="majorHAnsi" w:hAnsiTheme="majorHAnsi" w:cstheme="majorHAnsi"/>
-                    <w:sz w:val="20"/>
-                    <w:szCs w:val="20"/>
-                  </w:rPr>
-                  <w:t>{{client}}</w:t>
-                </w:r>
-              </w:sdtContent>
-            </w:sdt>
+              <w:t>{{client}}</w:t>
+            </w:r>
             <w:r>
               <w:rPr>
                 <w:rFonts w:asciiTheme="majorHAnsi" w:hAnsiTheme="majorHAnsi" w:cstheme="majorHAnsi"/>
@@ -2368,16 +2042,7 @@
                 <w:sz w:val="20"/>
                 <w:szCs w:val="20"/>
               </w:rPr>
-              <w:t>work_</w:t>
-            </w:r>
-            <w:proofErr w:type="gramStart"/>
-            <w:r>
-              <w:rPr>
-                <w:rFonts w:asciiTheme="majorHAnsi" w:hAnsiTheme="majorHAnsi" w:cstheme="majorHAnsi"/>
-                <w:sz w:val="20"/>
-                <w:szCs w:val="20"/>
-              </w:rPr>
-              <w:t>type</w:t>
+              <w:t>work_type</w:t>
             </w:r>
             <w:proofErr w:type="spellEnd"/>
             <w:r>
@@ -2394,16 +2059,7 @@
                 <w:sz w:val="20"/>
                 <w:szCs w:val="20"/>
               </w:rPr>
-              <w:t>.</w:t>
-            </w:r>
-            <w:proofErr w:type="gramEnd"/>
-            <w:r>
-              <w:rPr>
-                <w:rFonts w:asciiTheme="majorHAnsi" w:hAnsiTheme="majorHAnsi" w:cstheme="majorHAnsi"/>
-                <w:sz w:val="20"/>
-                <w:szCs w:val="20"/>
-              </w:rPr>
-              <w:t xml:space="preserve"> </w:t>
+              <w:t xml:space="preserve">. </w:t>
             </w:r>
             <w:r>
               <w:rPr>
@@ -2523,68 +2179,61 @@
         <w:trPr>
           <w:trHeight w:val="879"/>
         </w:trPr>
-        <w:sdt>
-          <w:sdtPr>
-            <w:rPr>
-              <w:rStyle w:val="CenturyGothicBold"/>
-              <w:rFonts w:asciiTheme="majorHAnsi" w:hAnsiTheme="majorHAnsi" w:cstheme="majorHAnsi"/>
-              <w:b/>
-              <w:bCs w:val="0"/>
-              <w:sz w:val="20"/>
-              <w:szCs w:val="20"/>
-            </w:rPr>
-            <w:id w:val="-395204899"/>
-            <w:placeholder>
-              <w:docPart w:val="1047CE33AD5F4A1C8ECF60E5FC508664"/>
-            </w:placeholder>
-            <w15:color w:val="32AF37"/>
-            <w:comboBox>
-              <w:listItem w:value="Choose an item."/>
-              <w:listItem w:displayText="LUMP SUM FEE" w:value="LUMP SUM FEE"/>
-              <w:listItem w:displayText="TIME AND MATERIAL (N.T.E)" w:value="TIME AND MATERIAL (N.T.E)"/>
-              <w:listItem w:displayText="TIME AND MATERIAL ESTIMATED MAX" w:value="TIME AND MATERIAL ESTIMATED MAX"/>
-              <w:listItem w:displayText="TIME AND MATERIALS" w:value="TIME AND MATERIALS"/>
-            </w:comboBox>
-          </w:sdtPr>
-          <w:sdtContent>
-            <w:tc>
-              <w:tcPr>
-                <w:tcW w:w="1980" w:type="dxa"/>
-                <w:gridSpan w:val="2"/>
-                <w:vMerge w:val="restart"/>
-                <w:tcBorders>
-                  <w:top w:val="single" w:sz="4" w:space="0" w:color="A6A6A6" w:themeColor="background1" w:themeShade="A6"/>
-                  <w:left w:val="single" w:sz="4" w:space="0" w:color="A6A6A6" w:themeColor="background1" w:themeShade="A6"/>
-                  <w:bottom w:val="single" w:sz="4" w:space="0" w:color="A6A6A6" w:themeColor="background1" w:themeShade="A6"/>
-                  <w:right w:val="single" w:sz="4" w:space="0" w:color="A6A6A6" w:themeColor="background1" w:themeShade="A6"/>
-                </w:tcBorders>
-                <w:vAlign w:val="center"/>
-              </w:tcPr>
-              <w:p>
-                <w:pPr>
-                  <w:pStyle w:val="Heading1"/>
-                  <w:jc w:val="left"/>
-                  <w:rPr>
-                    <w:rFonts w:asciiTheme="majorHAnsi" w:hAnsiTheme="majorHAnsi" w:cstheme="majorHAnsi"/>
-                    <w:sz w:val="20"/>
-                    <w:szCs w:val="20"/>
-                  </w:rPr>
-                </w:pPr>
-                <w:r>
-                  <w:rPr>
-                    <w:rStyle w:val="CenturyGothicBold"/>
-                    <w:rFonts w:asciiTheme="majorHAnsi" w:hAnsiTheme="majorHAnsi" w:cstheme="majorHAnsi"/>
-                    <w:b/>
-                    <w:bCs w:val="0"/>
-                    <w:sz w:val="20"/>
-                    <w:szCs w:val="20"/>
-                  </w:rPr>
-                  <w:t>LUMP SUM FEE</w:t>
-                </w:r>
-              </w:p>
-            </w:tc>
-          </w:sdtContent>
-        </w:sdt>
+        <w:tc>
+          <w:tcPr>
+            <w:tcW w:w="1980" w:type="dxa"/>
+            <w:gridSpan w:val="2"/>
+            <w:vMerge w:val="restart"/>
+            <w:tcBorders>
+              <w:top w:val="single" w:sz="4" w:space="0" w:color="A6A6A6" w:themeColor="background1" w:themeShade="A6"/>
+              <w:left w:val="single" w:sz="4" w:space="0" w:color="A6A6A6" w:themeColor="background1" w:themeShade="A6"/>
+              <w:bottom w:val="single" w:sz="4" w:space="0" w:color="A6A6A6" w:themeColor="background1" w:themeShade="A6"/>
+              <w:right w:val="single" w:sz="4" w:space="0" w:color="A6A6A6" w:themeColor="background1" w:themeShade="A6"/>
+            </w:tcBorders>
+            <w:vAlign w:val="center"/>
+          </w:tcPr>
+          <w:p>
+            <w:pPr>
+              <w:pStyle w:val="Heading1"/>
+              <w:jc w:val="left"/>
+              <w:rPr>
+                <w:rFonts w:asciiTheme="majorHAnsi" w:hAnsiTheme="majorHAnsi" w:cstheme="majorHAnsi"/>
+                <w:bCs w:val="0"/>
+                <w:sz w:val="20"/>
+                <w:szCs w:val="20"/>
+              </w:rPr>
+            </w:pPr>
+            <w:r>
+              <w:rPr>
+                <w:rFonts w:asciiTheme="majorHAnsi" w:hAnsiTheme="majorHAnsi" w:cstheme="majorHAnsi"/>
+                <w:bCs w:val="0"/>
+                <w:sz w:val="20"/>
+                <w:szCs w:val="20"/>
+              </w:rPr>
+              <w:t>{{</w:t>
+            </w:r>
+            <w:proofErr w:type="spellStart"/>
+            <w:r>
+              <w:rPr>
+                <w:rFonts w:asciiTheme="majorHAnsi" w:hAnsiTheme="majorHAnsi" w:cstheme="majorHAnsi"/>
+                <w:bCs w:val="0"/>
+                <w:sz w:val="20"/>
+                <w:szCs w:val="20"/>
+              </w:rPr>
+              <w:t>fee_type</w:t>
+            </w:r>
+            <w:proofErr w:type="spellEnd"/>
+            <w:r>
+              <w:rPr>
+                <w:rFonts w:asciiTheme="majorHAnsi" w:hAnsiTheme="majorHAnsi" w:cstheme="majorHAnsi"/>
+                <w:bCs w:val="0"/>
+                <w:sz w:val="20"/>
+                <w:szCs w:val="20"/>
+              </w:rPr>
+              <w:t>}}</w:t>
+            </w:r>
+          </w:p>
+        </w:tc>
         <w:tc>
           <w:tcPr>
             <w:tcW w:w="8466" w:type="dxa"/>
@@ -2817,37 +2466,16 @@
                 <w:szCs w:val="20"/>
               </w:rPr>
             </w:pPr>
-            <w:sdt>
-              <w:sdtPr>
-                <w:rPr>
-                  <w:rFonts w:asciiTheme="majorHAnsi" w:hAnsiTheme="majorHAnsi" w:cstheme="majorHAnsi"/>
-                  <w:b/>
-                  <w:bCs/>
-                  <w:sz w:val="20"/>
-                  <w:szCs w:val="20"/>
-                </w:rPr>
-                <w:alias w:val="Company"/>
-                <w:tag w:val=""/>
-                <w:id w:val="83881407"/>
-                <w:placeholder>
-                  <w:docPart w:val="156C5E2E7D174A68B691406E61C1140C"/>
-                </w:placeholder>
-                <w:dataBinding w:prefixMappings="xmlns:ns0='http://schemas.openxmlformats.org/officeDocument/2006/extended-properties' " w:xpath="/ns0:Properties[1]/ns0:Company[1]" w:storeItemID="{6668398D-A668-4E3E-A5EB-62B293D839F1}"/>
-                <w:text/>
-              </w:sdtPr>
-              <w:sdtContent>
-                <w:r>
-                  <w:rPr>
-                    <w:rFonts w:asciiTheme="majorHAnsi" w:hAnsiTheme="majorHAnsi" w:cstheme="majorHAnsi"/>
-                    <w:b/>
-                    <w:bCs/>
-                    <w:sz w:val="20"/>
-                    <w:szCs w:val="20"/>
-                  </w:rPr>
-                  <w:t>{{client}}</w:t>
-                </w:r>
-              </w:sdtContent>
-            </w:sdt>
+            <w:r>
+              <w:rPr>
+                <w:rFonts w:asciiTheme="majorHAnsi" w:hAnsiTheme="majorHAnsi" w:cstheme="majorHAnsi"/>
+                <w:b/>
+                <w:bCs/>
+                <w:sz w:val="20"/>
+                <w:szCs w:val="20"/>
+              </w:rPr>
+              <w:t>{{client}}</w:t>
+            </w:r>
             <w:r>
               <w:rPr>
                 <w:rFonts w:asciiTheme="majorHAnsi" w:hAnsiTheme="majorHAnsi" w:cstheme="majorHAnsi"/>
@@ -2902,7 +2530,16 @@
                 <w:sz w:val="20"/>
                 <w:szCs w:val="20"/>
               </w:rPr>
-              <w:t>By: ____________________</w:t>
+              <w:t>By</w:t>
+            </w:r>
+            <w:proofErr w:type="gramEnd"/>
+            <w:r>
+              <w:rPr>
+                <w:rFonts w:asciiTheme="majorHAnsi" w:hAnsiTheme="majorHAnsi" w:cstheme="majorHAnsi"/>
+                <w:sz w:val="20"/>
+                <w:szCs w:val="20"/>
+              </w:rPr>
+              <w:t>: ____________________</w:t>
             </w:r>
             <w:r>
               <w:rPr>
@@ -2918,7 +2555,32 @@
                 <w:sz w:val="20"/>
                 <w:szCs w:val="20"/>
               </w:rPr>
-              <w:t>_____</w:t>
+              <w:t xml:space="preserve">_____ </w:t>
+            </w:r>
+            <w:proofErr w:type="gramStart"/>
+            <w:r>
+              <w:rPr>
+                <w:rFonts w:asciiTheme="majorHAnsi" w:hAnsiTheme="majorHAnsi" w:cstheme="majorHAnsi"/>
+                <w:sz w:val="20"/>
+                <w:szCs w:val="20"/>
+              </w:rPr>
+              <w:t>Date:</w:t>
+            </w:r>
+            <w:r>
+              <w:rPr>
+                <w:rFonts w:asciiTheme="majorHAnsi" w:hAnsiTheme="majorHAnsi" w:cstheme="majorHAnsi"/>
+                <w:sz w:val="20"/>
+                <w:szCs w:val="20"/>
+              </w:rPr>
+              <w:t xml:space="preserve"> </w:t>
+            </w:r>
+            <w:r>
+              <w:rPr>
+                <w:rFonts w:asciiTheme="majorHAnsi" w:hAnsiTheme="majorHAnsi" w:cstheme="majorHAnsi"/>
+                <w:sz w:val="20"/>
+                <w:szCs w:val="20"/>
+              </w:rPr>
+              <w:t>{{</w:t>
             </w:r>
             <w:proofErr w:type="gramEnd"/>
             <w:r>
@@ -2927,7 +2589,24 @@
                 <w:sz w:val="20"/>
                 <w:szCs w:val="20"/>
               </w:rPr>
-              <w:t xml:space="preserve"> Date:</w:t>
+              <w:t>today}}</w:t>
+            </w:r>
+          </w:p>
+          <w:p>
+            <w:pPr>
+              <w:rPr>
+                <w:rFonts w:asciiTheme="majorHAnsi" w:hAnsiTheme="majorHAnsi" w:cstheme="majorHAnsi"/>
+                <w:sz w:val="20"/>
+                <w:szCs w:val="20"/>
+              </w:rPr>
+            </w:pPr>
+            <w:r>
+              <w:rPr>
+                <w:rFonts w:asciiTheme="majorHAnsi" w:hAnsiTheme="majorHAnsi" w:cstheme="majorHAnsi"/>
+                <w:sz w:val="20"/>
+                <w:szCs w:val="20"/>
+              </w:rPr>
+              <w:t>Name/Title:</w:t>
             </w:r>
             <w:r>
               <w:rPr>
@@ -2943,57 +2622,7 @@
                 <w:sz w:val="20"/>
                 <w:szCs w:val="20"/>
               </w:rPr>
-              <w:fldChar w:fldCharType="begin"/>
-            </w:r>
-            <w:r>
-              <w:rPr>
-                <w:rFonts w:asciiTheme="majorHAnsi" w:hAnsiTheme="majorHAnsi" w:cstheme="majorHAnsi"/>
-                <w:sz w:val="20"/>
-                <w:szCs w:val="20"/>
-              </w:rPr>
-              <w:instrText xml:space="preserve"> DATE  \@ "M/d/yyyy"  \* MERGEFORMAT </w:instrText>
-            </w:r>
-            <w:r>
-              <w:rPr>
-                <w:rFonts w:asciiTheme="majorHAnsi" w:hAnsiTheme="majorHAnsi" w:cstheme="majorHAnsi"/>
-                <w:sz w:val="20"/>
-                <w:szCs w:val="20"/>
-              </w:rPr>
-              <w:fldChar w:fldCharType="separate"/>
-            </w:r>
-            <w:r>
-              <w:rPr>
-                <w:rFonts w:asciiTheme="majorHAnsi" w:hAnsiTheme="majorHAnsi" w:cstheme="majorHAnsi"/>
-                <w:noProof/>
-                <w:sz w:val="20"/>
-                <w:szCs w:val="20"/>
-              </w:rPr>
-              <w:t>3/30/2026</w:t>
-            </w:r>
-            <w:r>
-              <w:rPr>
-                <w:rFonts w:asciiTheme="majorHAnsi" w:hAnsiTheme="majorHAnsi" w:cstheme="majorHAnsi"/>
-                <w:sz w:val="20"/>
-                <w:szCs w:val="20"/>
-              </w:rPr>
-              <w:fldChar w:fldCharType="end"/>
-            </w:r>
-          </w:p>
-          <w:p>
-            <w:pPr>
-              <w:rPr>
-                <w:rFonts w:asciiTheme="majorHAnsi" w:hAnsiTheme="majorHAnsi" w:cstheme="majorHAnsi"/>
-                <w:sz w:val="20"/>
-                <w:szCs w:val="20"/>
-              </w:rPr>
-            </w:pPr>
-            <w:r>
-              <w:rPr>
-                <w:rFonts w:asciiTheme="majorHAnsi" w:hAnsiTheme="majorHAnsi" w:cstheme="majorHAnsi"/>
-                <w:sz w:val="20"/>
-                <w:szCs w:val="20"/>
-              </w:rPr>
-              <w:t>Name/Title:</w:t>
+              <w:t>John Paul Youssef, President</w:t>
             </w:r>
             <w:r>
               <w:rPr>
@@ -3003,22 +2632,6 @@
               </w:rPr>
               <w:t xml:space="preserve"> </w:t>
             </w:r>
-            <w:r>
-              <w:rPr>
-                <w:rFonts w:asciiTheme="majorHAnsi" w:hAnsiTheme="majorHAnsi" w:cstheme="majorHAnsi"/>
-                <w:sz w:val="20"/>
-                <w:szCs w:val="20"/>
-              </w:rPr>
-              <w:t>John Paul Youssef, President</w:t>
-            </w:r>
-            <w:r>
-              <w:rPr>
-                <w:rFonts w:asciiTheme="majorHAnsi" w:hAnsiTheme="majorHAnsi" w:cstheme="majorHAnsi"/>
-                <w:sz w:val="20"/>
-                <w:szCs w:val="20"/>
-              </w:rPr>
-              <w:t xml:space="preserve"> </w:t>
-            </w:r>
           </w:p>
           <w:p>
             <w:pPr>
@@ -3036,56 +2649,25 @@
               </w:rPr>
               <w:t xml:space="preserve">                      </w:t>
             </w:r>
-            <w:sdt>
-              <w:sdtPr>
-                <w:rPr>
-                  <w:rFonts w:asciiTheme="majorHAnsi" w:hAnsiTheme="majorHAnsi" w:cstheme="majorHAnsi"/>
-                  <w:sz w:val="20"/>
-                  <w:szCs w:val="20"/>
-                </w:rPr>
-                <w:id w:val="-1037040562"/>
-                <w:lock w:val="contentLocked"/>
-                <w:placeholder>
-                  <w:docPart w:val="9BD5E286AC124E939074CD84108411F0"/>
-                </w:placeholder>
-                <w:group/>
-              </w:sdtPr>
-              <w:sdtContent>
-                <w:sdt>
-                  <w:sdtPr>
-                    <w:rPr>
-                      <w:rStyle w:val="Style3"/>
-                    </w:rPr>
-                    <w:id w:val="1108478970"/>
-                    <w:placeholder>
-                      <w:docPart w:val="94D03D0810C84ED58A95B1C392EEAD92"/>
-                    </w:placeholder>
-                    <w15:color w:val="33CC33"/>
-                    <w:dropDownList>
-                      <w:listItem w:displayText="Choose a Principal" w:value="Choose a Principal"/>
-                      <w:listItem w:displayText="Ryan Wilkerson, Principal, #S4728" w:value="Ryan Wilkerson, Principal, #S4728"/>
-                      <w:listItem w:displayText="Michael Gemmill, Principal, #S4703" w:value="Michael Gemmill, Principal, #S4703"/>
-                      <w:listItem w:displayText="Kelly Weldon, Principal, #S5780" w:value="Kelly Weldon, Principal, #S5780"/>
-                    </w:dropDownList>
-                  </w:sdtPr>
-                  <w:sdtContent>
-                    <w:r>
-                      <w:rPr>
-                        <w:rStyle w:val="Style3"/>
-                      </w:rPr>
-                      <w:t>Choose a Principal</w:t>
-                    </w:r>
-                  </w:sdtContent>
-                </w:sdt>
-              </w:sdtContent>
-            </w:sdt>
-            <w:r>
-              <w:rPr>
-                <w:rFonts w:asciiTheme="majorHAnsi" w:hAnsiTheme="majorHAnsi" w:cstheme="majorHAnsi"/>
-                <w:sz w:val="20"/>
-                <w:szCs w:val="20"/>
-              </w:rPr>
-              <w:t xml:space="preserve"> </w:t>
+            <w:r>
+              <w:rPr>
+                <w:rStyle w:val="Style3"/>
+              </w:rPr>
+              <w:t>{{</w:t>
+            </w:r>
+            <w:proofErr w:type="spellStart"/>
+            <w:r>
+              <w:rPr>
+                <w:rStyle w:val="Style3"/>
+              </w:rPr>
+              <w:t>principal_name</w:t>
+            </w:r>
+            <w:proofErr w:type="spellEnd"/>
+            <w:r>
+              <w:rPr>
+                <w:rStyle w:val="Style3"/>
+              </w:rPr>
+              <w:t>}}</w:t>
             </w:r>
           </w:p>
         </w:tc>
@@ -3164,7 +2746,16 @@
                 <w:sz w:val="20"/>
                 <w:szCs w:val="20"/>
               </w:rPr>
-              <w:t>Name/Title:</w:t>
+              <w:t>Name/</w:t>
+            </w:r>
+            <w:proofErr w:type="gramStart"/>
+            <w:r>
+              <w:rPr>
+                <w:rFonts w:asciiTheme="majorHAnsi" w:hAnsiTheme="majorHAnsi" w:cstheme="majorHAnsi"/>
+                <w:sz w:val="20"/>
+                <w:szCs w:val="20"/>
+              </w:rPr>
+              <w:t>Title:</w:t>
             </w:r>
             <w:r>
               <w:rPr>
@@ -3174,139 +2765,33 @@
               </w:rPr>
               <w:t xml:space="preserve"> </w:t>
             </w:r>
-            <w:sdt>
-              <w:sdtPr>
-                <w:rPr>
-                  <w:rFonts w:asciiTheme="majorHAnsi" w:hAnsiTheme="majorHAnsi" w:cstheme="majorHAnsi"/>
-                  <w:sz w:val="20"/>
-                  <w:szCs w:val="20"/>
-                </w:rPr>
-                <w:alias w:val="Comments"/>
-                <w:tag w:val=""/>
-                <w:id w:val="797270637"/>
-                <w:placeholder>
-                  <w:docPart w:val="611A296B68CB49ED85EC1EAED1A576EF"/>
-                </w:placeholder>
-                <w:dataBinding w:prefixMappings="xmlns:ns0='http://purl.org/dc/elements/1.1/' xmlns:ns1='http://schemas.openxmlformats.org/package/2006/metadata/core-properties' " w:xpath="/ns1:coreProperties[1]/ns0:description[1]" w:storeItemID="{6C3C8BC8-F283-45AE-878A-BAB7291924A1}"/>
-                <w:text w:multiLine="1"/>
-              </w:sdtPr>
-              <w:sdtContent>
-                <w:r>
-                  <w:rPr>
-                    <w:rFonts w:asciiTheme="majorHAnsi" w:hAnsiTheme="majorHAnsi" w:cstheme="majorHAnsi"/>
-                    <w:sz w:val="20"/>
-                    <w:szCs w:val="20"/>
-                  </w:rPr>
-                  <w:t>{{</w:t>
-                </w:r>
-                <w:proofErr w:type="spellStart"/>
-                <w:r>
-                  <w:rPr>
-                    <w:rFonts w:asciiTheme="majorHAnsi" w:hAnsiTheme="majorHAnsi" w:cstheme="majorHAnsi"/>
-                    <w:sz w:val="20"/>
-                    <w:szCs w:val="20"/>
-                  </w:rPr>
-                  <w:t>Fname_R</w:t>
-                </w:r>
-                <w:proofErr w:type="spellEnd"/>
-                <w:r>
-                  <w:rPr>
-                    <w:rFonts w:asciiTheme="majorHAnsi" w:hAnsiTheme="majorHAnsi" w:cstheme="majorHAnsi"/>
-                    <w:sz w:val="20"/>
-                    <w:szCs w:val="20"/>
-                  </w:rPr>
-                  <w:t>}}</w:t>
-                </w:r>
-              </w:sdtContent>
-            </w:sdt>
-            <w:r>
-              <w:rPr>
-                <w:rFonts w:asciiTheme="majorHAnsi" w:hAnsiTheme="majorHAnsi" w:cstheme="majorHAnsi"/>
-                <w:sz w:val="20"/>
-                <w:szCs w:val="20"/>
-              </w:rPr>
-              <w:t xml:space="preserve"> </w:t>
-            </w:r>
-            <w:sdt>
-              <w:sdtPr>
-                <w:rPr>
-                  <w:rFonts w:asciiTheme="majorHAnsi" w:hAnsiTheme="majorHAnsi" w:cstheme="majorHAnsi"/>
-                  <w:sz w:val="20"/>
-                  <w:szCs w:val="20"/>
-                </w:rPr>
-                <w:alias w:val="Company Fax"/>
-                <w:tag w:val=""/>
-                <w:id w:val="-1566720886"/>
-                <w:placeholder>
-                  <w:docPart w:val="801075F5147B4ED2AC7216589E986CCC"/>
-                </w:placeholder>
-                <w:dataBinding w:prefixMappings="xmlns:ns0='http://schemas.microsoft.com/office/2006/coverPageProps' " w:xpath="/ns0:CoverPageProperties[1]/ns0:CompanyFax[1]" w:storeItemID="{55AF091B-3C7A-41E3-B477-F2FDAA23CFDA}"/>
-                <w:text/>
-              </w:sdtPr>
-              <w:sdtContent>
-                <w:r>
-                  <w:rPr>
-                    <w:rFonts w:asciiTheme="majorHAnsi" w:hAnsiTheme="majorHAnsi" w:cstheme="majorHAnsi"/>
-                    <w:sz w:val="20"/>
-                    <w:szCs w:val="20"/>
-                  </w:rPr>
-                  <w:t>{{Lname_R}}</w:t>
-                </w:r>
-              </w:sdtContent>
-            </w:sdt>
-            <w:r>
-              <w:rPr>
-                <w:rFonts w:asciiTheme="majorHAnsi" w:hAnsiTheme="majorHAnsi" w:cstheme="majorHAnsi"/>
-                <w:sz w:val="20"/>
-                <w:szCs w:val="20"/>
-              </w:rPr>
-              <w:t xml:space="preserve">, </w:t>
-            </w:r>
-            <w:sdt>
-              <w:sdtPr>
-                <w:rPr>
-                  <w:rFonts w:asciiTheme="majorHAnsi" w:hAnsiTheme="majorHAnsi" w:cstheme="majorHAnsi"/>
-                  <w:sz w:val="20"/>
-                  <w:szCs w:val="20"/>
-                </w:rPr>
-                <w:alias w:val="Title"/>
-                <w:tag w:val=""/>
-                <w:id w:val="-299608112"/>
-                <w:placeholder>
-                  <w:docPart w:val="6FE35C7A532048AC9CFD41A854860F51"/>
-                </w:placeholder>
-                <w:dataBinding w:prefixMappings="xmlns:ns0='http://purl.org/dc/elements/1.1/' xmlns:ns1='http://schemas.openxmlformats.org/package/2006/metadata/core-properties' " w:xpath="/ns1:coreProperties[1]/ns0:title[1]" w:storeItemID="{6C3C8BC8-F283-45AE-878A-BAB7291924A1}"/>
-                <w:text/>
-              </w:sdtPr>
-              <w:sdtContent>
-                <w:r>
-                  <w:rPr>
-                    <w:rFonts w:asciiTheme="majorHAnsi" w:hAnsiTheme="majorHAnsi" w:cstheme="majorHAnsi"/>
-                    <w:sz w:val="20"/>
-                    <w:szCs w:val="20"/>
-                  </w:rPr>
-                  <w:t>{{</w:t>
-                </w:r>
-                <w:proofErr w:type="spellStart"/>
-                <w:r>
-                  <w:rPr>
-                    <w:rFonts w:asciiTheme="majorHAnsi" w:hAnsiTheme="majorHAnsi" w:cstheme="majorHAnsi"/>
-                    <w:sz w:val="20"/>
-                    <w:szCs w:val="20"/>
-                  </w:rPr>
-                  <w:t>title_R</w:t>
-                </w:r>
-                <w:proofErr w:type="spellEnd"/>
-                <w:r>
-                  <w:rPr>
-                    <w:rFonts w:asciiTheme="majorHAnsi" w:hAnsiTheme="majorHAnsi" w:cstheme="majorHAnsi"/>
-                    <w:sz w:val="20"/>
-                    <w:szCs w:val="20"/>
-                  </w:rPr>
-                  <w:t>}}</w:t>
-                </w:r>
-              </w:sdtContent>
-            </w:sdt>
+            <w:r>
+              <w:rPr>
+                <w:rFonts w:asciiTheme="majorHAnsi" w:hAnsiTheme="majorHAnsi" w:cstheme="majorHAnsi"/>
+                <w:sz w:val="20"/>
+                <w:szCs w:val="20"/>
+              </w:rPr>
+              <w:t>{{</w:t>
+            </w:r>
+            <w:proofErr w:type="spellStart"/>
+            <w:proofErr w:type="gramEnd"/>
+            <w:r>
+              <w:rPr>
+                <w:rFonts w:asciiTheme="majorHAnsi" w:hAnsiTheme="majorHAnsi" w:cstheme="majorHAnsi"/>
+                <w:sz w:val="20"/>
+                <w:szCs w:val="20"/>
+              </w:rPr>
+              <w:t>client_signed</w:t>
+            </w:r>
+            <w:proofErr w:type="spellEnd"/>
+            <w:r>
+              <w:rPr>
+                <w:rFonts w:asciiTheme="majorHAnsi" w:hAnsiTheme="majorHAnsi" w:cstheme="majorHAnsi"/>
+                <w:sz w:val="20"/>
+                <w:szCs w:val="20"/>
+              </w:rPr>
+              <w:t>}}</w:t>
+            </w:r>
           </w:p>
           <w:p>
             <w:pPr>
@@ -3505,43 +2990,44 @@
                 <w:sz w:val="18"/>
                 <w:szCs w:val="18"/>
               </w:rPr>
-              <w:t xml:space="preserve">Project Manager: </w:t>
-            </w:r>
-            <w:sdt>
-              <w:sdtPr>
-                <w:rPr>
-                  <w:rFonts w:asciiTheme="majorHAnsi" w:hAnsiTheme="majorHAnsi" w:cstheme="majorHAnsi"/>
-                  <w:sz w:val="18"/>
-                  <w:szCs w:val="18"/>
-                </w:rPr>
-                <w:id w:val="-1295433884"/>
-                <w:placeholder>
-                  <w:docPart w:val="3A620355563C46788AC59308D70ACA22"/>
-                </w:placeholder>
-                <w15:color w:val="32AF37"/>
-                <w:dropDownList>
-                  <w:listItem w:displayText="Choose a project manager" w:value="Choose a project manager"/>
-                  <w:listItem w:displayText="Anthony Giammona" w:value="Anthony Giammona"/>
-                  <w:listItem w:displayText="Jacob Rodriguez" w:value="Jacob Rodriguez"/>
-                  <w:listItem w:displayText="Jim Zeiner" w:value="Jim Zeiner"/>
-                  <w:listItem w:displayText="Kelly Weldon" w:value="Kelly Weldon"/>
-                  <w:listItem w:displayText="Michael Gemmill" w:value="Michael Gemmill"/>
-                  <w:listItem w:displayText="Owen Hata" w:value="Owen Hata"/>
-                  <w:listItem w:displayText="Ryan Wilkerson" w:value="Ryan Wilkerson"/>
-                  <w:listItem w:displayText="Sudharshan Navalpakkam" w:value="Sudharshan Navalpakkam"/>
-                </w:dropDownList>
-              </w:sdtPr>
-              <w:sdtContent>
-                <w:r>
-                  <w:rPr>
-                    <w:rFonts w:asciiTheme="majorHAnsi" w:hAnsiTheme="majorHAnsi" w:cstheme="majorHAnsi"/>
-                    <w:sz w:val="18"/>
-                    <w:szCs w:val="18"/>
-                  </w:rPr>
-                  <w:t>Choose a project manager</w:t>
-                </w:r>
-              </w:sdtContent>
-            </w:sdt>
+              <w:t xml:space="preserve">Project </w:t>
+            </w:r>
+            <w:proofErr w:type="gramStart"/>
+            <w:r>
+              <w:rPr>
+                <w:rFonts w:asciiTheme="majorHAnsi" w:hAnsiTheme="majorHAnsi" w:cstheme="majorHAnsi"/>
+                <w:sz w:val="18"/>
+                <w:szCs w:val="18"/>
+              </w:rPr>
+              <w:t xml:space="preserve">Manager: </w:t>
+            </w:r>
+            <w:r>
+              <w:rPr>
+                <w:rFonts w:asciiTheme="majorHAnsi" w:hAnsiTheme="majorHAnsi" w:cstheme="majorHAnsi"/>
+                <w:sz w:val="18"/>
+                <w:szCs w:val="18"/>
+              </w:rPr>
+              <w:t>{{</w:t>
+            </w:r>
+            <w:proofErr w:type="spellStart"/>
+            <w:proofErr w:type="gramEnd"/>
+            <w:r>
+              <w:rPr>
+                <w:rFonts w:asciiTheme="majorHAnsi" w:hAnsiTheme="majorHAnsi" w:cstheme="majorHAnsi"/>
+                <w:sz w:val="18"/>
+                <w:szCs w:val="18"/>
+              </w:rPr>
+              <w:t>project_manager</w:t>
+            </w:r>
+            <w:proofErr w:type="spellEnd"/>
+            <w:r>
+              <w:rPr>
+                <w:rFonts w:asciiTheme="majorHAnsi" w:hAnsiTheme="majorHAnsi" w:cstheme="majorHAnsi"/>
+                <w:sz w:val="18"/>
+                <w:szCs w:val="18"/>
+              </w:rPr>
+              <w:t>}}</w:t>
+            </w:r>
           </w:p>
           <w:p>
             <w:pPr>
@@ -3927,51 +3413,32 @@
                 <w:szCs w:val="20"/>
               </w:rPr>
             </w:pPr>
-            <w:sdt>
-              <w:sdtPr>
-                <w:rPr>
-                  <w:rFonts w:asciiTheme="majorHAnsi" w:hAnsiTheme="majorHAnsi" w:cstheme="majorHAnsi"/>
-                  <w:sz w:val="20"/>
-                  <w:szCs w:val="20"/>
-                </w:rPr>
-                <w:alias w:val="Manager"/>
-                <w:tag w:val=""/>
-                <w:id w:val="-258912843"/>
-                <w:placeholder>
-                  <w:docPart w:val="7BB813CF28BE463380BF3CCFB2EEB6F0"/>
-                </w:placeholder>
-                <w:dataBinding w:prefixMappings="xmlns:ns0='http://schemas.openxmlformats.org/officeDocument/2006/extended-properties' " w:xpath="/ns0:Properties[1]/ns0:Manager[1]" w:storeItemID="{6668398D-A668-4E3E-A5EB-62B293D839F1}"/>
-                <w:text/>
-              </w:sdtPr>
-              <w:sdtContent>
-                <w:r>
-                  <w:rPr>
-                    <w:rFonts w:asciiTheme="majorHAnsi" w:hAnsiTheme="majorHAnsi" w:cstheme="majorHAnsi"/>
-                    <w:sz w:val="20"/>
-                    <w:szCs w:val="20"/>
-                  </w:rPr>
-                  <w:t>{{</w:t>
-                </w:r>
-                <w:proofErr w:type="spellStart"/>
-                <w:r>
-                  <w:rPr>
-                    <w:rFonts w:asciiTheme="majorHAnsi" w:hAnsiTheme="majorHAnsi" w:cstheme="majorHAnsi"/>
-                    <w:sz w:val="20"/>
-                    <w:szCs w:val="20"/>
-                  </w:rPr>
-                  <w:t>nya_project_code</w:t>
-                </w:r>
-                <w:proofErr w:type="spellEnd"/>
-                <w:r>
-                  <w:rPr>
-                    <w:rFonts w:asciiTheme="majorHAnsi" w:hAnsiTheme="majorHAnsi" w:cstheme="majorHAnsi"/>
-                    <w:sz w:val="20"/>
-                    <w:szCs w:val="20"/>
-                  </w:rPr>
-                  <w:t>}}</w:t>
-                </w:r>
-              </w:sdtContent>
-            </w:sdt>
+            <w:r>
+              <w:rPr>
+                <w:rFonts w:asciiTheme="majorHAnsi" w:hAnsiTheme="majorHAnsi" w:cstheme="majorHAnsi"/>
+                <w:sz w:val="20"/>
+                <w:szCs w:val="20"/>
+              </w:rPr>
+              <w:t>{{</w:t>
+            </w:r>
+            <w:proofErr w:type="spellStart"/>
+            <w:r>
+              <w:rPr>
+                <w:rFonts w:asciiTheme="majorHAnsi" w:hAnsiTheme="majorHAnsi" w:cstheme="majorHAnsi"/>
+                <w:sz w:val="20"/>
+                <w:szCs w:val="20"/>
+              </w:rPr>
+              <w:t>nya_project_code</w:t>
+            </w:r>
+            <w:proofErr w:type="spellEnd"/>
+            <w:r>
+              <w:rPr>
+                <w:rFonts w:asciiTheme="majorHAnsi" w:hAnsiTheme="majorHAnsi" w:cstheme="majorHAnsi"/>
+                <w:sz w:val="20"/>
+                <w:szCs w:val="20"/>
+              </w:rPr>
+              <w:t>}}</w:t>
+            </w:r>
           </w:p>
         </w:tc>
         <w:tc>
@@ -4044,43 +3511,35 @@
               </w:rPr>
               <w:t xml:space="preserve"> </w:t>
             </w:r>
-            <w:sdt>
-              <w:sdtPr>
-                <w:rPr>
-                  <w:rStyle w:val="CenturyGothic"/>
-                  <w:rFonts w:asciiTheme="majorHAnsi" w:hAnsiTheme="majorHAnsi" w:cstheme="majorHAnsi"/>
-                  <w:sz w:val="20"/>
-                  <w:szCs w:val="20"/>
-                </w:rPr>
-                <w:id w:val="-1975047729"/>
-                <w:placeholder>
-                  <w:docPart w:val="64828DE9F35D49539E84D7B4E1B4F11A"/>
-                </w:placeholder>
-                <w:showingPlcHdr/>
-                <w15:color w:val="32AF37"/>
-                <w:date>
-                  <w:dateFormat w:val="MMMM d, yyyy"/>
-                  <w:lid w:val="en-US"/>
-                  <w:storeMappedDataAs w:val="dateTime"/>
-                  <w:calendar w:val="gregorian"/>
-                </w:date>
-              </w:sdtPr>
-              <w:sdtEndPr>
-                <w:rPr>
-                  <w:rStyle w:val="DefaultParagraphFont"/>
-                </w:rPr>
-              </w:sdtEndPr>
-              <w:sdtContent>
-                <w:r>
-                  <w:rPr>
-                    <w:rFonts w:asciiTheme="majorHAnsi" w:hAnsiTheme="majorHAnsi" w:cstheme="majorHAnsi"/>
-                    <w:sz w:val="20"/>
-                    <w:szCs w:val="20"/>
-                  </w:rPr>
-                  <w:t>Month, Day, Year</w:t>
-                </w:r>
-              </w:sdtContent>
-            </w:sdt>
+            <w:r>
+              <w:rPr>
+                <w:rStyle w:val="CenturyGothic"/>
+                <w:rFonts w:asciiTheme="majorHAnsi" w:hAnsiTheme="majorHAnsi" w:cstheme="majorHAnsi"/>
+                <w:sz w:val="20"/>
+                <w:szCs w:val="20"/>
+              </w:rPr>
+              <w:t>{{</w:t>
+            </w:r>
+            <w:proofErr w:type="spellStart"/>
+            <w:r>
+              <w:rPr>
+                <w:rStyle w:val="CenturyGothic"/>
+                <w:rFonts w:asciiTheme="majorHAnsi" w:hAnsiTheme="majorHAnsi" w:cstheme="majorHAnsi"/>
+                <w:sz w:val="20"/>
+                <w:szCs w:val="20"/>
+              </w:rPr>
+              <w:t>received_date</w:t>
+            </w:r>
+            <w:proofErr w:type="spellEnd"/>
+            <w:r>
+              <w:rPr>
+                <w:rStyle w:val="CenturyGothic"/>
+                <w:rFonts w:asciiTheme="majorHAnsi" w:hAnsiTheme="majorHAnsi" w:cstheme="majorHAnsi"/>
+                <w:sz w:val="20"/>
+                <w:szCs w:val="20"/>
+              </w:rPr>
+              <w:t>}}</w:t>
+            </w:r>
           </w:p>
         </w:tc>
       </w:tr>
@@ -4725,7 +4184,27 @@
           <w:sz w:val="18"/>
           <w:szCs w:val="18"/>
         </w:rPr>
-        <w:t>Client acknowledges the risks to Consultant inherent in housing projects, the disparity between Consultant’s fee and Consultant’s potential liability for problems or alleged problems with such condominium projects, and the higher risk that there will be litigation brought by the housing owners or an association of said owners (“Owner Actions”).  Accordingly, Client agrees, to the fullest extent permitted by law, to indemnify the Consultant, its officers, directors, employees (collectively, “Consultant”) against all damages, liabilities or costs, including reasonable attorneys’ fees and court costs (“Claims”), as a result of Owner Actions, except for those Claims arising from allegations of, or Consultant’s sole negligence, and/or willful misconduct in the provision of Consultant’s professional services.</w:t>
+        <w:t xml:space="preserve">Client acknowledges the risks to </w:t>
+      </w:r>
+      <w:proofErr w:type="gramStart"/>
+      <w:r>
+        <w:rPr>
+          <w:rFonts w:cs="Arial"/>
+          <w:bCs/>
+          <w:sz w:val="18"/>
+          <w:szCs w:val="18"/>
+        </w:rPr>
+        <w:t>Consultant</w:t>
+      </w:r>
+      <w:proofErr w:type="gramEnd"/>
+      <w:r>
+        <w:rPr>
+          <w:rFonts w:cs="Arial"/>
+          <w:bCs/>
+          <w:sz w:val="18"/>
+          <w:szCs w:val="18"/>
+        </w:rPr>
+        <w:t xml:space="preserve"> inherent in housing projects, the disparity between Consultant’s fee and Consultant’s potential liability for problems or alleged problems with such condominium projects, and the higher risk that there will be litigation brought by the housing owners or an association of said owners (“Owner Actions”).  Accordingly, Client agrees, to the fullest extent permitted by law, to indemnify the Consultant, its officers, directors, employees (collectively, “Consultant”) against all damages, liabilities or costs, including reasonable attorneys’ fees and court costs (“Claims”), as a result of Owner Actions, except for those Claims arising from allegations of, or Consultant’s sole negligence, and/or willful misconduct in the provision of Consultant’s professional services.</w:t>
       </w:r>
     </w:p>
     <w:p>
@@ -7967,36 +7446,14 @@
         <w:sz w:val="20"/>
         <w:szCs w:val="20"/>
       </w:rPr>
-      <w:fldChar w:fldCharType="begin"/>
+      <w:t>{{today}}</w:t>
     </w:r>
     <w:r>
       <w:rPr>
         <w:sz w:val="20"/>
         <w:szCs w:val="20"/>
       </w:rPr>
-      <w:instrText xml:space="preserve"> DATE  \@ "MMMM d, yyyy"  \* MERGEFORMAT </w:instrText>
-    </w:r>
-    <w:r>
-      <w:rPr>
-        <w:sz w:val="20"/>
-        <w:szCs w:val="20"/>
-      </w:rPr>
-      <w:fldChar w:fldCharType="separate"/>
-    </w:r>
-    <w:r>
-      <w:rPr>
-        <w:noProof/>
-        <w:sz w:val="20"/>
-        <w:szCs w:val="20"/>
-      </w:rPr>
-      <w:t>March 30, 2026</w:t>
-    </w:r>
-    <w:r>
-      <w:rPr>
-        <w:sz w:val="20"/>
-        <w:szCs w:val="20"/>
-      </w:rPr>
-      <w:fldChar w:fldCharType="end"/>
+      <w:t xml:space="preserve"> </w:t>
     </w:r>
   </w:p>
   <w:p>
@@ -8008,76 +7465,29 @@
         <w:szCs w:val="20"/>
       </w:rPr>
     </w:pPr>
-    <w:sdt>
-      <w:sdtPr>
-        <w:rPr>
-          <w:sz w:val="20"/>
-          <w:szCs w:val="20"/>
-        </w:rPr>
-        <w:alias w:val="Comments"/>
-        <w:tag w:val=""/>
-        <w:id w:val="1298328153"/>
-        <w:placeholder>
-          <w:docPart w:val="7BB813CF28BE463380BF3CCFB2EEB6F0"/>
-        </w:placeholder>
-        <w:dataBinding w:prefixMappings="xmlns:ns0='http://purl.org/dc/elements/1.1/' xmlns:ns1='http://schemas.openxmlformats.org/package/2006/metadata/core-properties' " w:xpath="/ns1:coreProperties[1]/ns0:description[1]" w:storeItemID="{6C3C8BC8-F283-45AE-878A-BAB7291924A1}"/>
-        <w:text w:multiLine="1"/>
-      </w:sdtPr>
-      <w:sdtContent>
-        <w:r>
-          <w:rPr>
-            <w:sz w:val="20"/>
-            <w:szCs w:val="20"/>
-          </w:rPr>
-          <w:t>{{</w:t>
-        </w:r>
-        <w:proofErr w:type="spellStart"/>
-        <w:r>
-          <w:rPr>
-            <w:sz w:val="20"/>
-            <w:szCs w:val="20"/>
-          </w:rPr>
-          <w:t>Fname_R</w:t>
-        </w:r>
-        <w:proofErr w:type="spellEnd"/>
-        <w:r>
-          <w:rPr>
-            <w:sz w:val="20"/>
-            <w:szCs w:val="20"/>
-          </w:rPr>
-          <w:t>}}</w:t>
-        </w:r>
-      </w:sdtContent>
-    </w:sdt>
     <w:r>
       <w:rPr>
         <w:sz w:val="20"/>
         <w:szCs w:val="20"/>
       </w:rPr>
-      <w:t xml:space="preserve"> </w:t>
+      <w:t>{{</w:t>
     </w:r>
-    <w:sdt>
-      <w:sdtPr>
-        <w:rPr>
-          <w:sz w:val="20"/>
-          <w:szCs w:val="20"/>
-        </w:rPr>
-        <w:alias w:val="Company Fax"/>
-        <w:tag w:val=""/>
-        <w:id w:val="166905711"/>
-        <w:dataBinding w:prefixMappings="xmlns:ns0='http://schemas.microsoft.com/office/2006/coverPageProps' " w:xpath="/ns0:CoverPageProperties[1]/ns0:CompanyFax[1]" w:storeItemID="{55AF091B-3C7A-41E3-B477-F2FDAA23CFDA}"/>
-        <w:text/>
-      </w:sdtPr>
-      <w:sdtContent>
-        <w:r>
-          <w:rPr>
-            <w:sz w:val="20"/>
-            <w:szCs w:val="20"/>
-          </w:rPr>
-          <w:t>{{Lname_R}}</w:t>
-        </w:r>
-      </w:sdtContent>
-    </w:sdt>
+    <w:proofErr w:type="spellStart"/>
+    <w:r>
+      <w:rPr>
+        <w:sz w:val="20"/>
+        <w:szCs w:val="20"/>
+      </w:rPr>
+      <w:t>client_name</w:t>
+    </w:r>
+    <w:proofErr w:type="spellEnd"/>
+    <w:r>
+      <w:rPr>
+        <w:sz w:val="20"/>
+        <w:szCs w:val="20"/>
+      </w:rPr>
+      <w:t>}}</w:t>
+    </w:r>
     <w:r>
       <w:rPr>
         <w:sz w:val="20"/>
@@ -8085,83 +7495,47 @@
       </w:rPr>
       <w:t xml:space="preserve">, </w:t>
     </w:r>
-    <w:sdt>
-      <w:sdtPr>
-        <w:rPr>
-          <w:sz w:val="20"/>
-          <w:szCs w:val="20"/>
-        </w:rPr>
-        <w:alias w:val="Company"/>
-        <w:tag w:val=""/>
-        <w:id w:val="1732118979"/>
-        <w:placeholder>
-          <w:docPart w:val="635CA4957C59439F8BDCD49B12B53FFF"/>
-        </w:placeholder>
-        <w:dataBinding w:prefixMappings="xmlns:ns0='http://schemas.openxmlformats.org/officeDocument/2006/extended-properties' " w:xpath="/ns0:Properties[1]/ns0:Company[1]" w:storeItemID="{6668398D-A668-4E3E-A5EB-62B293D839F1}"/>
-        <w:text/>
-      </w:sdtPr>
-      <w:sdtContent>
-        <w:r>
-          <w:rPr>
-            <w:sz w:val="20"/>
-            <w:szCs w:val="20"/>
-          </w:rPr>
-          <w:t>{{client}}</w:t>
-        </w:r>
-      </w:sdtContent>
-    </w:sdt>
-  </w:p>
-  <w:sdt>
-    <w:sdtPr>
+    <w:r>
       <w:rPr>
         <w:sz w:val="20"/>
         <w:szCs w:val="20"/>
       </w:rPr>
-      <w:alias w:val="Abstract"/>
-      <w:tag w:val=""/>
-      <w:id w:val="66853805"/>
-      <w:placeholder>
-        <w:docPart w:val="611A296B68CB49ED85EC1EAED1A576EF"/>
-      </w:placeholder>
-      <w:dataBinding w:prefixMappings="xmlns:ns0='http://schemas.microsoft.com/office/2006/coverPageProps' " w:xpath="/ns0:CoverPageProperties[1]/ns0:Abstract[1]" w:storeItemID="{55AF091B-3C7A-41E3-B477-F2FDAA23CFDA}"/>
-      <w:text/>
-    </w:sdtPr>
-    <w:sdtContent>
-      <w:p>
-        <w:pPr>
-          <w:spacing w:after="0" w:line="240" w:lineRule="auto"/>
-          <w:jc w:val="right"/>
-          <w:rPr>
-            <w:sz w:val="20"/>
-            <w:szCs w:val="20"/>
-          </w:rPr>
-        </w:pPr>
-        <w:r>
-          <w:rPr>
-            <w:sz w:val="20"/>
-            <w:szCs w:val="20"/>
-          </w:rPr>
-          <w:t>{{</w:t>
-        </w:r>
-        <w:proofErr w:type="spellStart"/>
-        <w:r>
-          <w:rPr>
-            <w:sz w:val="20"/>
-            <w:szCs w:val="20"/>
-          </w:rPr>
-          <w:t>project_title</w:t>
-        </w:r>
-        <w:proofErr w:type="spellEnd"/>
-        <w:r>
-          <w:rPr>
-            <w:sz w:val="20"/>
-            <w:szCs w:val="20"/>
-          </w:rPr>
-          <w:t>}}</w:t>
-        </w:r>
-      </w:p>
-    </w:sdtContent>
-  </w:sdt>
+      <w:t>{{client}}</w:t>
+    </w:r>
+  </w:p>
+  <w:p>
+    <w:pPr>
+      <w:spacing w:after="0" w:line="240" w:lineRule="auto"/>
+      <w:jc w:val="right"/>
+      <w:rPr>
+        <w:sz w:val="20"/>
+        <w:szCs w:val="20"/>
+      </w:rPr>
+    </w:pPr>
+    <w:r>
+      <w:rPr>
+        <w:sz w:val="20"/>
+        <w:szCs w:val="20"/>
+      </w:rPr>
+      <w:t>{{</w:t>
+    </w:r>
+    <w:proofErr w:type="spellStart"/>
+    <w:r>
+      <w:rPr>
+        <w:sz w:val="20"/>
+        <w:szCs w:val="20"/>
+      </w:rPr>
+      <w:t>project_title</w:t>
+    </w:r>
+    <w:proofErr w:type="spellEnd"/>
+    <w:r>
+      <w:rPr>
+        <w:sz w:val="20"/>
+        <w:szCs w:val="20"/>
+      </w:rPr>
+      <w:t>}}</w:t>
+    </w:r>
+  </w:p>
   <w:p>
     <w:pPr>
       <w:pStyle w:val="Header"/>
@@ -8171,47 +7545,29 @@
         <w:szCs w:val="20"/>
       </w:rPr>
     </w:pPr>
-    <w:sdt>
-      <w:sdtPr>
-        <w:rPr>
-          <w:sz w:val="20"/>
-          <w:szCs w:val="20"/>
-        </w:rPr>
-        <w:alias w:val="Manager"/>
-        <w:tag w:val=""/>
-        <w:id w:val="1000940681"/>
-        <w:placeholder>
-          <w:docPart w:val="FBE85D5F94B84034991B5406DE3E355F"/>
-        </w:placeholder>
-        <w:dataBinding w:prefixMappings="xmlns:ns0='http://schemas.openxmlformats.org/officeDocument/2006/extended-properties' " w:xpath="/ns0:Properties[1]/ns0:Manager[1]" w:storeItemID="{6668398D-A668-4E3E-A5EB-62B293D839F1}"/>
-        <w:text/>
-      </w:sdtPr>
-      <w:sdtContent>
-        <w:r>
-          <w:rPr>
-            <w:sz w:val="20"/>
-            <w:szCs w:val="20"/>
-          </w:rPr>
-          <w:t>{{</w:t>
-        </w:r>
-        <w:proofErr w:type="spellStart"/>
-        <w:r>
-          <w:rPr>
-            <w:sz w:val="20"/>
-            <w:szCs w:val="20"/>
-          </w:rPr>
-          <w:t>nya_project_code</w:t>
-        </w:r>
-        <w:proofErr w:type="spellEnd"/>
-        <w:r>
-          <w:rPr>
-            <w:sz w:val="20"/>
-            <w:szCs w:val="20"/>
-          </w:rPr>
-          <w:t>}}</w:t>
-        </w:r>
-      </w:sdtContent>
-    </w:sdt>
+    <w:r>
+      <w:rPr>
+        <w:sz w:val="20"/>
+        <w:szCs w:val="20"/>
+      </w:rPr>
+      <w:t>{{</w:t>
+    </w:r>
+    <w:proofErr w:type="spellStart"/>
+    <w:r>
+      <w:rPr>
+        <w:sz w:val="20"/>
+        <w:szCs w:val="20"/>
+      </w:rPr>
+      <w:t>nya_project_code</w:t>
+    </w:r>
+    <w:proofErr w:type="spellEnd"/>
+    <w:r>
+      <w:rPr>
+        <w:sz w:val="20"/>
+        <w:szCs w:val="20"/>
+      </w:rPr>
+      <w:t>}}</w:t>
+    </w:r>
     <w:r>
       <w:rPr>
         <w:sz w:val="20"/>
@@ -9525,35 +8881,6 @@
   <w:docParts>
     <w:docPart>
       <w:docPartPr>
-        <w:name w:val="03C497ED04D2429D90C4BA38E6E3BB61"/>
-        <w:category>
-          <w:name w:val="General"/>
-          <w:gallery w:val="placeholder"/>
-        </w:category>
-        <w:types>
-          <w:type w:val="bbPlcHdr"/>
-        </w:types>
-        <w:behaviors>
-          <w:behavior w:val="content"/>
-        </w:behaviors>
-        <w:guid w:val="{0C6222F3-46A7-4EB0-884A-1CE322FF04C8}"/>
-      </w:docPartPr>
-      <w:docPartBody>
-        <w:p>
-          <w:pPr>
-            <w:pStyle w:val="03C497ED04D2429D90C4BA38E6E3BB61"/>
-          </w:pPr>
-          <w:r>
-            <w:rPr>
-              <w:rStyle w:val="PlaceholderText"/>
-            </w:rPr>
-            <w:t>[Abstract]</w:t>
-          </w:r>
-        </w:p>
-      </w:docPartBody>
-    </w:docPart>
-    <w:docPart>
-      <w:docPartPr>
         <w:name w:val="D6E17CF6BF9946F39C1106F0B46D3A79"/>
         <w:category>
           <w:name w:val="General"/>
@@ -9614,209 +8941,6 @@
               <w:szCs w:val="20"/>
             </w:rPr>
             <w:t>REVISED:</w:t>
-          </w:r>
-        </w:p>
-      </w:docPartBody>
-    </w:docPart>
-    <w:docPart>
-      <w:docPartPr>
-        <w:name w:val="90F9207E710449C394502BCE2D9557B0"/>
-        <w:category>
-          <w:name w:val="General"/>
-          <w:gallery w:val="placeholder"/>
-        </w:category>
-        <w:types>
-          <w:type w:val="bbPlcHdr"/>
-        </w:types>
-        <w:behaviors>
-          <w:behavior w:val="content"/>
-        </w:behaviors>
-        <w:guid w:val="{12F65F80-EF38-4016-B2E8-FC2FCDB68B26}"/>
-      </w:docPartPr>
-      <w:docPartBody>
-        <w:p>
-          <w:pPr>
-            <w:pStyle w:val="90F9207E710449C394502BCE2D9557B0"/>
-          </w:pPr>
-          <w:r>
-            <w:rPr>
-              <w:rStyle w:val="PlaceholderText"/>
-            </w:rPr>
-            <w:t>[Manager]</w:t>
-          </w:r>
-        </w:p>
-      </w:docPartBody>
-    </w:docPart>
-    <w:docPart>
-      <w:docPartPr>
-        <w:name w:val="18376EC9D5194D969BBC365E79690AD7"/>
-        <w:category>
-          <w:name w:val="General"/>
-          <w:gallery w:val="placeholder"/>
-        </w:category>
-        <w:types>
-          <w:type w:val="bbPlcHdr"/>
-        </w:types>
-        <w:behaviors>
-          <w:behavior w:val="content"/>
-        </w:behaviors>
-        <w:guid w:val="{98BB2695-2FE8-427E-9F84-0D1C00C37EBF}"/>
-      </w:docPartPr>
-      <w:docPartBody>
-        <w:p>
-          <w:pPr>
-            <w:pStyle w:val="18376EC9D5194D969BBC365E79690AD7"/>
-          </w:pPr>
-          <w:r>
-            <w:rPr>
-              <w:rStyle w:val="PlaceholderText"/>
-            </w:rPr>
-            <w:t>[Company]</w:t>
-          </w:r>
-        </w:p>
-      </w:docPartBody>
-    </w:docPart>
-    <w:docPart>
-      <w:docPartPr>
-        <w:name w:val="116815963BB84359A53653EBB8E88613"/>
-        <w:category>
-          <w:name w:val="General"/>
-          <w:gallery w:val="placeholder"/>
-        </w:category>
-        <w:types>
-          <w:type w:val="bbPlcHdr"/>
-        </w:types>
-        <w:behaviors>
-          <w:behavior w:val="content"/>
-        </w:behaviors>
-        <w:guid w:val="{6A2C1957-3379-4624-9128-87D03530B74C}"/>
-      </w:docPartPr>
-      <w:docPartBody>
-        <w:p>
-          <w:pPr>
-            <w:pStyle w:val="116815963BB84359A53653EBB8E88613"/>
-          </w:pPr>
-          <w:r>
-            <w:rPr>
-              <w:rStyle w:val="PlaceholderText"/>
-            </w:rPr>
-            <w:t>[Comments]</w:t>
-          </w:r>
-        </w:p>
-      </w:docPartBody>
-    </w:docPart>
-    <w:docPart>
-      <w:docPartPr>
-        <w:name w:val="3DAD588D58684F0BB72AAF6F298DF15B"/>
-        <w:category>
-          <w:name w:val="General"/>
-          <w:gallery w:val="placeholder"/>
-        </w:category>
-        <w:types>
-          <w:type w:val="bbPlcHdr"/>
-        </w:types>
-        <w:behaviors>
-          <w:behavior w:val="content"/>
-        </w:behaviors>
-        <w:guid w:val="{3478AC44-3DA7-4FEE-A77F-4B3C08A5E1EE}"/>
-      </w:docPartPr>
-      <w:docPartBody>
-        <w:p>
-          <w:pPr>
-            <w:pStyle w:val="3DAD588D58684F0BB72AAF6F298DF15B"/>
-          </w:pPr>
-          <w:r>
-            <w:rPr>
-              <w:rStyle w:val="PlaceholderText"/>
-            </w:rPr>
-            <w:t>[Company Fax]</w:t>
-          </w:r>
-        </w:p>
-      </w:docPartBody>
-    </w:docPart>
-    <w:docPart>
-      <w:docPartPr>
-        <w:name w:val="6C09CEC241A04607BEC0EE91F1A9D781"/>
-        <w:category>
-          <w:name w:val="General"/>
-          <w:gallery w:val="placeholder"/>
-        </w:category>
-        <w:types>
-          <w:type w:val="bbPlcHdr"/>
-        </w:types>
-        <w:behaviors>
-          <w:behavior w:val="content"/>
-        </w:behaviors>
-        <w:guid w:val="{37E6B6DB-183B-4748-99AA-7398C00F1452}"/>
-      </w:docPartPr>
-      <w:docPartBody>
-        <w:p>
-          <w:pPr>
-            <w:pStyle w:val="6C09CEC241A04607BEC0EE91F1A9D781"/>
-          </w:pPr>
-          <w:r>
-            <w:rPr>
-              <w:rStyle w:val="PlaceholderText"/>
-            </w:rPr>
-            <w:t>[Title]</w:t>
-          </w:r>
-        </w:p>
-      </w:docPartBody>
-    </w:docPart>
-    <w:docPart>
-      <w:docPartPr>
-        <w:name w:val="44C531E184D242218B8BDC5CAF487F59"/>
-        <w:category>
-          <w:name w:val="General"/>
-          <w:gallery w:val="placeholder"/>
-        </w:category>
-        <w:types>
-          <w:type w:val="bbPlcHdr"/>
-        </w:types>
-        <w:behaviors>
-          <w:behavior w:val="content"/>
-        </w:behaviors>
-        <w:guid w:val="{DD582AA3-571B-49C0-8A2F-9B55916E49D2}"/>
-      </w:docPartPr>
-      <w:docPartBody>
-        <w:p>
-          <w:pPr>
-            <w:pStyle w:val="44C531E184D242218B8BDC5CAF487F59"/>
-          </w:pPr>
-          <w:r>
-            <w:rPr>
-              <w:rStyle w:val="PlaceholderText"/>
-            </w:rPr>
-            <w:t>[Company]</w:t>
-          </w:r>
-        </w:p>
-      </w:docPartBody>
-    </w:docPart>
-    <w:docPart>
-      <w:docPartPr>
-        <w:name w:val="F516A635CC8B4A7FAE7432B54B847DA4"/>
-        <w:category>
-          <w:name w:val="General"/>
-          <w:gallery w:val="placeholder"/>
-        </w:category>
-        <w:types>
-          <w:type w:val="bbPlcHdr"/>
-        </w:types>
-        <w:behaviors>
-          <w:behavior w:val="content"/>
-        </w:behaviors>
-        <w:guid w:val="{425B3A96-A918-4429-8D02-6C5CFCE90A26}"/>
-      </w:docPartPr>
-      <w:docPartBody>
-        <w:p>
-          <w:pPr>
-            <w:pStyle w:val="F516A635CC8B4A7FAE7432B54B847DA4"/>
-          </w:pPr>
-          <w:r>
-            <w:rPr>
-              <w:rStyle w:val="PlaceholderText"/>
-            </w:rPr>
-            <w:t>[Company]</w:t>
           </w:r>
         </w:p>
       </w:docPartBody>
@@ -9884,122 +9008,6 @@
     </w:docPart>
     <w:docPart>
       <w:docPartPr>
-        <w:name w:val="1A636D5B73024EBB892EB9AD446AB78B"/>
-        <w:category>
-          <w:name w:val="General"/>
-          <w:gallery w:val="placeholder"/>
-        </w:category>
-        <w:types>
-          <w:type w:val="bbPlcHdr"/>
-        </w:types>
-        <w:behaviors>
-          <w:behavior w:val="content"/>
-        </w:behaviors>
-        <w:guid w:val="{B010F4AB-A5E5-405F-9F52-ED54689318C2}"/>
-      </w:docPartPr>
-      <w:docPartBody>
-        <w:p>
-          <w:pPr>
-            <w:pStyle w:val="1A636D5B73024EBB892EB9AD446AB78B"/>
-          </w:pPr>
-          <w:r>
-            <w:rPr>
-              <w:rStyle w:val="PlaceholderText"/>
-            </w:rPr>
-            <w:t>[Comments]</w:t>
-          </w:r>
-        </w:p>
-      </w:docPartBody>
-    </w:docPart>
-    <w:docPart>
-      <w:docPartPr>
-        <w:name w:val="7F717849E9704017B24D66515D73C652"/>
-        <w:category>
-          <w:name w:val="General"/>
-          <w:gallery w:val="placeholder"/>
-        </w:category>
-        <w:types>
-          <w:type w:val="bbPlcHdr"/>
-        </w:types>
-        <w:behaviors>
-          <w:behavior w:val="content"/>
-        </w:behaviors>
-        <w:guid w:val="{25A6E3F2-85C9-4958-B2F0-985055BE81DC}"/>
-      </w:docPartPr>
-      <w:docPartBody>
-        <w:p>
-          <w:pPr>
-            <w:pStyle w:val="7F717849E9704017B24D66515D73C652"/>
-          </w:pPr>
-          <w:r>
-            <w:rPr>
-              <w:rStyle w:val="PlaceholderText"/>
-            </w:rPr>
-            <w:t>[Company Fax]</w:t>
-          </w:r>
-        </w:p>
-      </w:docPartBody>
-    </w:docPart>
-    <w:docPart>
-      <w:docPartPr>
-        <w:name w:val="90C431DA247A4D90A0333664E418580A"/>
-        <w:category>
-          <w:name w:val="General"/>
-          <w:gallery w:val="placeholder"/>
-        </w:category>
-        <w:types>
-          <w:type w:val="bbPlcHdr"/>
-        </w:types>
-        <w:behaviors>
-          <w:behavior w:val="content"/>
-        </w:behaviors>
-        <w:guid w:val="{EC7F845C-4C87-442A-8742-73F9D68CB35B}"/>
-      </w:docPartPr>
-      <w:docPartBody>
-        <w:p>
-          <w:pPr>
-            <w:pStyle w:val="90C431DA247A4D90A0333664E418580A"/>
-          </w:pPr>
-          <w:r>
-            <w:rPr>
-              <w:rStyle w:val="PlaceholderText"/>
-            </w:rPr>
-            <w:t>[Company]</w:t>
-          </w:r>
-        </w:p>
-      </w:docPartBody>
-    </w:docPart>
-    <w:docPart>
-      <w:docPartPr>
-        <w:name w:val="1047CE33AD5F4A1C8ECF60E5FC508664"/>
-        <w:category>
-          <w:name w:val="General"/>
-          <w:gallery w:val="placeholder"/>
-        </w:category>
-        <w:types>
-          <w:type w:val="bbPlcHdr"/>
-        </w:types>
-        <w:behaviors>
-          <w:behavior w:val="content"/>
-        </w:behaviors>
-        <w:guid w:val="{AD7200B1-6EFA-440C-81B3-CE24863D717B}"/>
-      </w:docPartPr>
-      <w:docPartBody>
-        <w:p>
-          <w:pPr>
-            <w:pStyle w:val="1047CE33AD5F4A1C8ECF60E5FC508664"/>
-          </w:pPr>
-          <w:r>
-            <w:rPr>
-              <w:rStyle w:val="PlaceholderText"/>
-            </w:rPr>
-            <w:t>Choose an item.</w:t>
-          </w:r>
-        </w:p>
-      </w:docPartBody>
-    </w:docPart>
-    <w:docPart>
-      <w:docPartPr>
         <w:name w:val="FBE85D5F94B84034991B5406DE3E355F"/>
         <w:category>
           <w:name w:val="General"/>
@@ -10023,212 +9031,6 @@
               <w:rStyle w:val="PlaceholderText"/>
             </w:rPr>
             <w:t>Choose an item.</w:t>
-          </w:r>
-        </w:p>
-      </w:docPartBody>
-    </w:docPart>
-    <w:docPart>
-      <w:docPartPr>
-        <w:name w:val="156C5E2E7D174A68B691406E61C1140C"/>
-        <w:category>
-          <w:name w:val="General"/>
-          <w:gallery w:val="placeholder"/>
-        </w:category>
-        <w:types>
-          <w:type w:val="bbPlcHdr"/>
-        </w:types>
-        <w:behaviors>
-          <w:behavior w:val="content"/>
-        </w:behaviors>
-        <w:guid w:val="{2A754654-F181-4CA1-891C-BA1A0FE243A1}"/>
-      </w:docPartPr>
-      <w:docPartBody>
-        <w:p>
-          <w:pPr>
-            <w:pStyle w:val="156C5E2E7D174A68B691406E61C1140C"/>
-          </w:pPr>
-          <w:r>
-            <w:rPr>
-              <w:rStyle w:val="PlaceholderText"/>
-            </w:rPr>
-            <w:t>[Company]</w:t>
-          </w:r>
-        </w:p>
-      </w:docPartBody>
-    </w:docPart>
-    <w:docPart>
-      <w:docPartPr>
-        <w:name w:val="9BD5E286AC124E939074CD84108411F0"/>
-        <w:category>
-          <w:name w:val="General"/>
-          <w:gallery w:val="placeholder"/>
-        </w:category>
-        <w:types>
-          <w:type w:val="bbPlcHdr"/>
-        </w:types>
-        <w:behaviors>
-          <w:behavior w:val="content"/>
-        </w:behaviors>
-        <w:guid w:val="{9A45759D-210B-4852-9E8D-643589F4D22C}"/>
-      </w:docPartPr>
-      <w:docPartBody>
-        <w:p>
-          <w:pPr>
-            <w:pStyle w:val="9BD5E286AC124E939074CD84108411F0"/>
-          </w:pPr>
-          <w:r>
-            <w:rPr>
-              <w:rStyle w:val="PlaceholderText"/>
-            </w:rPr>
-            <w:t>Click or tap here to enter text.</w:t>
-          </w:r>
-        </w:p>
-      </w:docPartBody>
-    </w:docPart>
-    <w:docPart>
-      <w:docPartPr>
-        <w:name w:val="94D03D0810C84ED58A95B1C392EEAD92"/>
-        <w:category>
-          <w:name w:val="General"/>
-          <w:gallery w:val="placeholder"/>
-        </w:category>
-        <w:types>
-          <w:type w:val="bbPlcHdr"/>
-        </w:types>
-        <w:behaviors>
-          <w:behavior w:val="content"/>
-        </w:behaviors>
-        <w:guid w:val="{1A33A2F4-D600-4ADE-A972-EE052FDFA3F7}"/>
-      </w:docPartPr>
-      <w:docPartBody>
-        <w:p>
-          <w:pPr>
-            <w:pStyle w:val="94D03D0810C84ED58A95B1C392EEAD92"/>
-          </w:pPr>
-          <w:r>
-            <w:rPr>
-              <w:rStyle w:val="PlaceholderText"/>
-            </w:rPr>
-            <w:t>Choose an item.</w:t>
-          </w:r>
-        </w:p>
-      </w:docPartBody>
-    </w:docPart>
-    <w:docPart>
-      <w:docPartPr>
-        <w:name w:val="611A296B68CB49ED85EC1EAED1A576EF"/>
-        <w:category>
-          <w:name w:val="General"/>
-          <w:gallery w:val="placeholder"/>
-        </w:category>
-        <w:types>
-          <w:type w:val="bbPlcHdr"/>
-        </w:types>
-        <w:behaviors>
-          <w:behavior w:val="content"/>
-        </w:behaviors>
-        <w:guid w:val="{315D5D8A-D323-4F1A-947C-833AF3D5E180}"/>
-      </w:docPartPr>
-      <w:docPartBody>
-        <w:p>
-          <w:pPr>
-            <w:pStyle w:val="611A296B68CB49ED85EC1EAED1A576EF"/>
-          </w:pPr>
-          <w:r>
-            <w:rPr>
-              <w:rStyle w:val="PlaceholderText"/>
-            </w:rPr>
-            <w:t>[Comments]</w:t>
-          </w:r>
-        </w:p>
-      </w:docPartBody>
-    </w:docPart>
-    <w:docPart>
-      <w:docPartPr>
-        <w:name w:val="801075F5147B4ED2AC7216589E986CCC"/>
-        <w:category>
-          <w:name w:val="General"/>
-          <w:gallery w:val="placeholder"/>
-        </w:category>
-        <w:types>
-          <w:type w:val="bbPlcHdr"/>
-        </w:types>
-        <w:behaviors>
-          <w:behavior w:val="content"/>
-        </w:behaviors>
-        <w:guid w:val="{3712FC3C-F1FD-4D2D-9206-455664A7BAA4}"/>
-      </w:docPartPr>
-      <w:docPartBody>
-        <w:p>
-          <w:pPr>
-            <w:pStyle w:val="801075F5147B4ED2AC7216589E986CCC"/>
-          </w:pPr>
-          <w:r>
-            <w:rPr>
-              <w:rStyle w:val="PlaceholderText"/>
-            </w:rPr>
-            <w:t>[Company Fax]</w:t>
-          </w:r>
-        </w:p>
-      </w:docPartBody>
-    </w:docPart>
-    <w:docPart>
-      <w:docPartPr>
-        <w:name w:val="6FE35C7A532048AC9CFD41A854860F51"/>
-        <w:category>
-          <w:name w:val="General"/>
-          <w:gallery w:val="placeholder"/>
-        </w:category>
-        <w:types>
-          <w:type w:val="bbPlcHdr"/>
-        </w:types>
-        <w:behaviors>
-          <w:behavior w:val="content"/>
-        </w:behaviors>
-        <w:guid w:val="{71764980-4BF1-4CD6-93AC-6BCF941420B0}"/>
-      </w:docPartPr>
-      <w:docPartBody>
-        <w:p>
-          <w:pPr>
-            <w:pStyle w:val="6FE35C7A532048AC9CFD41A854860F51"/>
-          </w:pPr>
-          <w:r>
-            <w:rPr>
-              <w:rStyle w:val="PlaceholderText"/>
-            </w:rPr>
-            <w:t>[Title]</w:t>
-          </w:r>
-        </w:p>
-      </w:docPartBody>
-    </w:docPart>
-    <w:docPart>
-      <w:docPartPr>
-        <w:name w:val="3A620355563C46788AC59308D70ACA22"/>
-        <w:category>
-          <w:name w:val="General"/>
-          <w:gallery w:val="placeholder"/>
-        </w:category>
-        <w:types>
-          <w:type w:val="bbPlcHdr"/>
-        </w:types>
-        <w:behaviors>
-          <w:behavior w:val="content"/>
-        </w:behaviors>
-        <w:guid w:val="{CA2370BC-08CF-4FCD-8CFD-CD29D56F021F}"/>
-      </w:docPartPr>
-      <w:docPartBody>
-        <w:p>
-          <w:pPr>
-            <w:pStyle w:val="3A620355563C46788AC59308D70ACA22"/>
-          </w:pPr>
-          <w:r>
-            <w:rPr>
-              <w:rFonts w:asciiTheme="majorHAnsi" w:hAnsiTheme="majorHAnsi" w:cstheme="majorHAnsi"/>
-              <w:bCs/>
-              <w:sz w:val="18"/>
-              <w:szCs w:val="18"/>
-            </w:rPr>
-            <w:t>Choose a project manager.</w:t>
           </w:r>
         </w:p>
       </w:docPartBody>
@@ -10316,66 +9118,6 @@
               <w:rStyle w:val="PlaceholderText"/>
             </w:rPr>
             <w:t>[Category]</w:t>
-          </w:r>
-        </w:p>
-      </w:docPartBody>
-    </w:docPart>
-    <w:docPart>
-      <w:docPartPr>
-        <w:name w:val="7BB813CF28BE463380BF3CCFB2EEB6F0"/>
-        <w:category>
-          <w:name w:val="General"/>
-          <w:gallery w:val="placeholder"/>
-        </w:category>
-        <w:types>
-          <w:type w:val="bbPlcHdr"/>
-        </w:types>
-        <w:behaviors>
-          <w:behavior w:val="content"/>
-        </w:behaviors>
-        <w:guid w:val="{AE8611A8-4F9B-4530-9811-E5DF60FBDE6F}"/>
-      </w:docPartPr>
-      <w:docPartBody>
-        <w:p>
-          <w:pPr>
-            <w:pStyle w:val="7BB813CF28BE463380BF3CCFB2EEB6F0"/>
-          </w:pPr>
-          <w:r>
-            <w:rPr>
-              <w:rStyle w:val="PlaceholderText"/>
-            </w:rPr>
-            <w:t>[Manager]</w:t>
-          </w:r>
-        </w:p>
-      </w:docPartBody>
-    </w:docPart>
-    <w:docPart>
-      <w:docPartPr>
-        <w:name w:val="64828DE9F35D49539E84D7B4E1B4F11A"/>
-        <w:category>
-          <w:name w:val="General"/>
-          <w:gallery w:val="placeholder"/>
-        </w:category>
-        <w:types>
-          <w:type w:val="bbPlcHdr"/>
-        </w:types>
-        <w:behaviors>
-          <w:behavior w:val="content"/>
-        </w:behaviors>
-        <w:guid w:val="{30F19E29-BC3F-426F-B2A9-7647E243FEC3}"/>
-      </w:docPartPr>
-      <w:docPartBody>
-        <w:p>
-          <w:pPr>
-            <w:pStyle w:val="64828DE9F35D49539E84D7B4E1B4F11A"/>
-          </w:pPr>
-          <w:r>
-            <w:rPr>
-              <w:rFonts w:asciiTheme="majorHAnsi" w:hAnsiTheme="majorHAnsi" w:cstheme="majorHAnsi"/>
-              <w:sz w:val="20"/>
-              <w:szCs w:val="20"/>
-            </w:rPr>
-            <w:t>Month, Day, Year</w:t>
           </w:r>
         </w:p>
       </w:docPartBody>
@@ -10550,7 +9292,11 @@
     <w:rsid w:val="002B19DD"/>
     <w:rsid w:val="006A4B96"/>
     <w:rsid w:val="0095343B"/>
+    <w:rsid w:val="00B520D3"/>
+    <w:rsid w:val="00C12FA5"/>
+    <w:rsid w:val="00C710F3"/>
     <w:rsid w:val="00CB7F70"/>
+    <w:rsid w:val="00F970DF"/>
   </w:rsids>
   <m:mathPr>
     <m:mathFont m:val="Cambria Math"/>
@@ -11010,35 +9756,11 @@
       <w:color w:val="808080"/>
     </w:rPr>
   </w:style>
-  <w:style w:type="paragraph" w:customStyle="1" w:styleId="03C497ED04D2429D90C4BA38E6E3BB61">
-    <w:name w:val="03C497ED04D2429D90C4BA38E6E3BB61"/>
-  </w:style>
   <w:style w:type="paragraph" w:customStyle="1" w:styleId="D6E17CF6BF9946F39C1106F0B46D3A79">
     <w:name w:val="D6E17CF6BF9946F39C1106F0B46D3A79"/>
   </w:style>
   <w:style w:type="paragraph" w:customStyle="1" w:styleId="BAD420C8AA01472A8410FBE9C354ACF7">
     <w:name w:val="BAD420C8AA01472A8410FBE9C354ACF7"/>
-  </w:style>
-  <w:style w:type="paragraph" w:customStyle="1" w:styleId="90F9207E710449C394502BCE2D9557B0">
-    <w:name w:val="90F9207E710449C394502BCE2D9557B0"/>
-  </w:style>
-  <w:style w:type="paragraph" w:customStyle="1" w:styleId="18376EC9D5194D969BBC365E79690AD7">
-    <w:name w:val="18376EC9D5194D969BBC365E79690AD7"/>
-  </w:style>
-  <w:style w:type="paragraph" w:customStyle="1" w:styleId="116815963BB84359A53653EBB8E88613">
-    <w:name w:val="116815963BB84359A53653EBB8E88613"/>
-  </w:style>
-  <w:style w:type="paragraph" w:customStyle="1" w:styleId="3DAD588D58684F0BB72AAF6F298DF15B">
-    <w:name w:val="3DAD588D58684F0BB72AAF6F298DF15B"/>
-  </w:style>
-  <w:style w:type="paragraph" w:customStyle="1" w:styleId="6C09CEC241A04607BEC0EE91F1A9D781">
-    <w:name w:val="6C09CEC241A04607BEC0EE91F1A9D781"/>
-  </w:style>
-  <w:style w:type="paragraph" w:customStyle="1" w:styleId="44C531E184D242218B8BDC5CAF487F59">
-    <w:name w:val="44C531E184D242218B8BDC5CAF487F59"/>
-  </w:style>
-  <w:style w:type="paragraph" w:customStyle="1" w:styleId="F516A635CC8B4A7FAE7432B54B847DA4">
-    <w:name w:val="F516A635CC8B4A7FAE7432B54B847DA4"/>
   </w:style>
   <w:style w:type="paragraph" w:customStyle="1" w:styleId="635CA4957C59439F8BDCD49B12B53FFF">
     <w:name w:val="635CA4957C59439F8BDCD49B12B53FFF"/>
@@ -11055,41 +9777,8 @@
   <w:style w:type="paragraph" w:customStyle="1" w:styleId="BAEDA66374AF438887EA8307BB7EA83D">
     <w:name w:val="BAEDA66374AF438887EA8307BB7EA83D"/>
   </w:style>
-  <w:style w:type="paragraph" w:customStyle="1" w:styleId="1A636D5B73024EBB892EB9AD446AB78B">
-    <w:name w:val="1A636D5B73024EBB892EB9AD446AB78B"/>
-  </w:style>
-  <w:style w:type="paragraph" w:customStyle="1" w:styleId="7F717849E9704017B24D66515D73C652">
-    <w:name w:val="7F717849E9704017B24D66515D73C652"/>
-  </w:style>
-  <w:style w:type="paragraph" w:customStyle="1" w:styleId="90C431DA247A4D90A0333664E418580A">
-    <w:name w:val="90C431DA247A4D90A0333664E418580A"/>
-  </w:style>
-  <w:style w:type="paragraph" w:customStyle="1" w:styleId="1047CE33AD5F4A1C8ECF60E5FC508664">
-    <w:name w:val="1047CE33AD5F4A1C8ECF60E5FC508664"/>
-  </w:style>
   <w:style w:type="paragraph" w:customStyle="1" w:styleId="FBE85D5F94B84034991B5406DE3E355F">
     <w:name w:val="FBE85D5F94B84034991B5406DE3E355F"/>
-  </w:style>
-  <w:style w:type="paragraph" w:customStyle="1" w:styleId="156C5E2E7D174A68B691406E61C1140C">
-    <w:name w:val="156C5E2E7D174A68B691406E61C1140C"/>
-  </w:style>
-  <w:style w:type="paragraph" w:customStyle="1" w:styleId="9BD5E286AC124E939074CD84108411F0">
-    <w:name w:val="9BD5E286AC124E939074CD84108411F0"/>
-  </w:style>
-  <w:style w:type="paragraph" w:customStyle="1" w:styleId="94D03D0810C84ED58A95B1C392EEAD92">
-    <w:name w:val="94D03D0810C84ED58A95B1C392EEAD92"/>
-  </w:style>
-  <w:style w:type="paragraph" w:customStyle="1" w:styleId="611A296B68CB49ED85EC1EAED1A576EF">
-    <w:name w:val="611A296B68CB49ED85EC1EAED1A576EF"/>
-  </w:style>
-  <w:style w:type="paragraph" w:customStyle="1" w:styleId="801075F5147B4ED2AC7216589E986CCC">
-    <w:name w:val="801075F5147B4ED2AC7216589E986CCC"/>
-  </w:style>
-  <w:style w:type="paragraph" w:customStyle="1" w:styleId="6FE35C7A532048AC9CFD41A854860F51">
-    <w:name w:val="6FE35C7A532048AC9CFD41A854860F51"/>
-  </w:style>
-  <w:style w:type="paragraph" w:customStyle="1" w:styleId="3A620355563C46788AC59308D70ACA22">
-    <w:name w:val="3A620355563C46788AC59308D70ACA22"/>
   </w:style>
   <w:style w:type="paragraph" w:customStyle="1" w:styleId="9EFA5E89168A4CBFBFDC0AAB011AAFD0">
     <w:name w:val="9EFA5E89168A4CBFBFDC0AAB011AAFD0"/>
@@ -11099,12 +9788,6 @@
   </w:style>
   <w:style w:type="paragraph" w:customStyle="1" w:styleId="DCEB25F6D3F740B39AA8F815215DF25C">
     <w:name w:val="DCEB25F6D3F740B39AA8F815215DF25C"/>
-  </w:style>
-  <w:style w:type="paragraph" w:customStyle="1" w:styleId="7BB813CF28BE463380BF3CCFB2EEB6F0">
-    <w:name w:val="7BB813CF28BE463380BF3CCFB2EEB6F0"/>
-  </w:style>
-  <w:style w:type="paragraph" w:customStyle="1" w:styleId="64828DE9F35D49539E84D7B4E1B4F11A">
-    <w:name w:val="64828DE9F35D49539E84D7B4E1B4F11A"/>
   </w:style>
   <w:style w:type="character" w:customStyle="1" w:styleId="BoldTextCAPS">
     <w:name w:val="Bold Text (CAPS)"/>
@@ -11433,10 +10116,10 @@
 <file path=customXml/item1.xml><?xml version="1.0" encoding="utf-8"?>
 <CoverPageProperties xmlns="http://schemas.microsoft.com/office/2006/coverPageProps">
   <PublishDate/>
-  <Abstract>{{project_title}}</Abstract>
+  <Abstract/>
   <CompanyAddress/>
   <CompanyPhone/>
-  <CompanyFax>{{Lname_R}}</CompanyFax>
+  <CompanyFax/>
   <CompanyEmail/>
 </CoverPageProperties>
 </file>

</xml_diff>

<commit_message>
chore(a250): update A250 template (user edit)
Verified: all form fields still substitute on render, unchanged from the
prior template (one pre-existing fragmented {{client}} placeholder remains,
identical to before — not introduced by this edit).

Co-Authored-By: Claude Opus 4.8 (1M context) <noreply@anthropic.com>
</commit_message>
<xml_diff>
--- a/templates/A250.docx
+++ b/templates/A250.docx
@@ -3087,7 +3087,7 @@
     <w:p>
       <w:pPr>
         <w:spacing w:after="0" w:line="240" w:lineRule="auto"/>
-        <w:ind w:right="270"/>
+        <w:ind w:left="180" w:right="270"/>
         <w:rPr>
           <w:rFonts w:asciiTheme="majorHAnsi" w:hAnsiTheme="majorHAnsi" w:cstheme="majorHAnsi"/>
           <w:sz w:val="20"/>
@@ -8592,6 +8592,8 @@
     <w:rsid w:val="00263835"/>
     <w:rsid w:val="002B19DD"/>
     <w:rsid w:val="006A4B96"/>
+    <w:rsid w:val="00837696"/>
+    <w:rsid w:val="008B0BD7"/>
     <w:rsid w:val="0095343B"/>
     <w:rsid w:val="00AE031D"/>
     <w:rsid w:val="00B520D3"/>

</xml_diff>